<commit_message>
Actualización de los archivos del Módulo 9
</commit_message>
<xml_diff>
--- a/modulo9.docx
+++ b/modulo9.docx
@@ -216,7 +216,15 @@
           <w:sz w:val="24"/>
           <w:szCs w:val="24"/>
         </w:rPr>
-        <w:t>2025</w:t>
+        <w:t>202</w:t>
+      </w:r>
+      <w:r>
+        <w:rPr>
+          <w:color w:val="888888"/>
+          <w:sz w:val="24"/>
+          <w:szCs w:val="24"/>
+        </w:rPr>
+        <w:t>6</w:t>
       </w:r>
     </w:p>
     <w:p>
@@ -898,47 +906,7 @@
           </w:tcPr>
           <w:p>
             <w:r>
-              <w:t xml:space="preserve">Google invierte fuertemente en I+D a través de Google </w:t>
-            </w:r>
-            <w:proofErr w:type="spellStart"/>
-            <w:r>
-              <w:t>DeepMind</w:t>
-            </w:r>
-            <w:proofErr w:type="spellEnd"/>
-            <w:r>
-              <w:t xml:space="preserve">, Google </w:t>
-            </w:r>
-            <w:proofErr w:type="spellStart"/>
-            <w:r>
-              <w:t>Research</w:t>
-            </w:r>
-            <w:proofErr w:type="spellEnd"/>
-            <w:r>
-              <w:t xml:space="preserve"> y X (</w:t>
-            </w:r>
-            <w:proofErr w:type="spellStart"/>
-            <w:r>
-              <w:t>the</w:t>
-            </w:r>
-            <w:proofErr w:type="spellEnd"/>
-            <w:r>
-              <w:t xml:space="preserve"> </w:t>
-            </w:r>
-            <w:proofErr w:type="spellStart"/>
-            <w:r>
-              <w:t>moonshot</w:t>
-            </w:r>
-            <w:proofErr w:type="spellEnd"/>
-            <w:r>
-              <w:t xml:space="preserve"> </w:t>
-            </w:r>
-            <w:proofErr w:type="spellStart"/>
-            <w:r>
-              <w:t>factory</w:t>
-            </w:r>
-            <w:proofErr w:type="spellEnd"/>
-            <w:r>
-              <w:t xml:space="preserve">). </w:t>
+              <w:t xml:space="preserve">Google invierte fuertemente en I+D a través de Google DeepMind, Google Research y X (the moonshot factory). </w:t>
             </w:r>
             <w:r>
               <w:t>Su liderazgo en inteligencia artificial generativa (Gemini), computación cuántica y tecnología sostenible lo posiciona como referente mundial. Para un perfil junior con base en ingeniería química y formación full stack, este entorno representa una oportunidad única de crecimiento técnico acelerado.</w:t>
@@ -1474,23 +1442,7 @@
         <w:t>posición</w:t>
       </w:r>
       <w:r>
-        <w:t xml:space="preserve">, a la vez que obtener </w:t>
-      </w:r>
-      <w:proofErr w:type="spellStart"/>
-      <w:r>
-        <w:t>informacion</w:t>
-      </w:r>
-      <w:proofErr w:type="spellEnd"/>
-      <w:r>
-        <w:t xml:space="preserve"> clave para evaluar la </w:t>
-      </w:r>
-      <w:proofErr w:type="spellStart"/>
-      <w:r>
-        <w:t>alineacion</w:t>
-      </w:r>
-      <w:proofErr w:type="spellEnd"/>
-      <w:r>
-        <w:t xml:space="preserve"> con mis objetivos profesionales:</w:t>
+        <w:t>, a la vez que obtener informacion clave para evaluar la alineacion con mis objetivos profesionales:</w:t>
       </w:r>
     </w:p>
     <w:p>
@@ -1581,36 +1533,8 @@
                 <w:bCs/>
                 <w:color w:val="FFFFFF"/>
               </w:rPr>
-              <w:t xml:space="preserve">Pregunta y </w:t>
-            </w:r>
-            <w:proofErr w:type="spellStart"/>
-            <w:r>
-              <w:rPr>
-                <w:b/>
-                <w:bCs/>
-                <w:color w:val="FFFFFF"/>
-              </w:rPr>
-              <w:t>justificacion</w:t>
-            </w:r>
-            <w:proofErr w:type="spellEnd"/>
-            <w:r>
-              <w:rPr>
-                <w:b/>
-                <w:bCs/>
-                <w:color w:val="FFFFFF"/>
-              </w:rPr>
-              <w:t xml:space="preserve"> </w:t>
-            </w:r>
-            <w:proofErr w:type="spellStart"/>
-            <w:r>
-              <w:rPr>
-                <w:b/>
-                <w:bCs/>
-                <w:color w:val="FFFFFF"/>
-              </w:rPr>
-              <w:t>estrategica</w:t>
-            </w:r>
-            <w:proofErr w:type="spellEnd"/>
+              <w:t>Pregunta y justificacion estrategica</w:t>
+            </w:r>
           </w:p>
         </w:tc>
       </w:tr>
@@ -1671,141 +1595,17 @@
                 <w:i/>
                 <w:iCs/>
               </w:rPr>
-              <w:t xml:space="preserve">"Como fomenta Google la </w:t>
-            </w:r>
-            <w:proofErr w:type="spellStart"/>
-            <w:r>
-              <w:rPr>
-                <w:b/>
-                <w:bCs/>
-                <w:i/>
-                <w:iCs/>
-              </w:rPr>
-              <w:t>colaboracion</w:t>
-            </w:r>
-            <w:proofErr w:type="spellEnd"/>
-            <w:r>
-              <w:rPr>
-                <w:b/>
-                <w:bCs/>
-                <w:i/>
-                <w:iCs/>
-              </w:rPr>
-              <w:t xml:space="preserve"> entre equipos de </w:t>
-            </w:r>
-            <w:proofErr w:type="spellStart"/>
-            <w:r>
-              <w:rPr>
-                <w:b/>
-                <w:bCs/>
-                <w:i/>
-                <w:iCs/>
-              </w:rPr>
-              <w:t>ingenieria</w:t>
-            </w:r>
-            <w:proofErr w:type="spellEnd"/>
-            <w:r>
-              <w:rPr>
-                <w:b/>
-                <w:bCs/>
-                <w:i/>
-                <w:iCs/>
-              </w:rPr>
-              <w:t xml:space="preserve"> industrial o </w:t>
-            </w:r>
-            <w:proofErr w:type="spellStart"/>
-            <w:r>
-              <w:rPr>
-                <w:b/>
-                <w:bCs/>
-                <w:i/>
-                <w:iCs/>
-              </w:rPr>
-              <w:t>cientifica</w:t>
-            </w:r>
-            <w:proofErr w:type="spellEnd"/>
-            <w:r>
-              <w:rPr>
-                <w:b/>
-                <w:bCs/>
-                <w:i/>
-                <w:iCs/>
-              </w:rPr>
-              <w:t xml:space="preserve"> y los equipos de desarrollo de software en proyectos de Google Cloud?"</w:t>
-            </w:r>
-          </w:p>
-          <w:p>
-            <w:proofErr w:type="spellStart"/>
+              <w:t>"Como fomenta Google la colaboracion entre equipos de ingenieria industrial o cientifica y los equipos de desarrollo de software en proyectos de Google Cloud?"</w:t>
+            </w:r>
+          </w:p>
+          <w:p>
             <w:r>
               <w:rPr>
                 <w:color w:val="666666"/>
                 <w:sz w:val="20"/>
                 <w:szCs w:val="20"/>
               </w:rPr>
-              <w:t>Justificacion</w:t>
-            </w:r>
-            <w:proofErr w:type="spellEnd"/>
-            <w:r>
-              <w:rPr>
-                <w:color w:val="666666"/>
-                <w:sz w:val="20"/>
-                <w:szCs w:val="20"/>
-              </w:rPr>
-              <w:t xml:space="preserve">: Esta pregunta me permite entender si existe espacio para perfiles </w:t>
-            </w:r>
-            <w:proofErr w:type="spellStart"/>
-            <w:r>
-              <w:rPr>
-                <w:color w:val="666666"/>
-                <w:sz w:val="20"/>
-                <w:szCs w:val="20"/>
-              </w:rPr>
-              <w:t>hibridos</w:t>
-            </w:r>
-            <w:proofErr w:type="spellEnd"/>
-            <w:r>
-              <w:rPr>
-                <w:color w:val="666666"/>
-                <w:sz w:val="20"/>
-                <w:szCs w:val="20"/>
-              </w:rPr>
-              <w:t xml:space="preserve"> como el </w:t>
-            </w:r>
-            <w:proofErr w:type="spellStart"/>
-            <w:r>
-              <w:rPr>
-                <w:color w:val="666666"/>
-                <w:sz w:val="20"/>
-                <w:szCs w:val="20"/>
-              </w:rPr>
-              <w:t>mio</w:t>
-            </w:r>
-            <w:proofErr w:type="spellEnd"/>
-            <w:r>
-              <w:rPr>
-                <w:color w:val="666666"/>
-                <w:sz w:val="20"/>
-                <w:szCs w:val="20"/>
-              </w:rPr>
-              <w:t xml:space="preserve"> y de </w:t>
-            </w:r>
-            <w:proofErr w:type="spellStart"/>
-            <w:r>
-              <w:rPr>
-                <w:color w:val="666666"/>
-                <w:sz w:val="20"/>
-                <w:szCs w:val="20"/>
-              </w:rPr>
-              <w:t>que</w:t>
-            </w:r>
-            <w:proofErr w:type="spellEnd"/>
-            <w:r>
-              <w:rPr>
-                <w:color w:val="666666"/>
-                <w:sz w:val="20"/>
-                <w:szCs w:val="20"/>
-              </w:rPr>
-              <w:t xml:space="preserve"> forma se valora la experiencia en dominios no tradicionales de IT.</w:t>
+              <w:t>Justificacion: Esta pregunta me permite entender si existe espacio para perfiles hibridos como el mio y de que forma se valora la experiencia en dominios no tradicionales de IT.</w:t>
             </w:r>
           </w:p>
         </w:tc>
@@ -1867,87 +1667,17 @@
                 <w:i/>
                 <w:iCs/>
               </w:rPr>
-              <w:t>"</w:t>
-            </w:r>
-            <w:proofErr w:type="spellStart"/>
-            <w:r>
-              <w:rPr>
-                <w:b/>
-                <w:bCs/>
-                <w:i/>
-                <w:iCs/>
-              </w:rPr>
-              <w:t>Cuales</w:t>
-            </w:r>
-            <w:proofErr w:type="spellEnd"/>
-            <w:r>
-              <w:rPr>
-                <w:b/>
-                <w:bCs/>
-                <w:i/>
-                <w:iCs/>
-              </w:rPr>
-              <w:t xml:space="preserve"> son las principales </w:t>
-            </w:r>
-            <w:proofErr w:type="spellStart"/>
-            <w:r>
-              <w:rPr>
-                <w:b/>
-                <w:bCs/>
-                <w:i/>
-                <w:iCs/>
-              </w:rPr>
-              <w:t>tecnologias</w:t>
-            </w:r>
-            <w:proofErr w:type="spellEnd"/>
-            <w:r>
-              <w:rPr>
-                <w:b/>
-                <w:bCs/>
-                <w:i/>
-                <w:iCs/>
-              </w:rPr>
-              <w:t xml:space="preserve"> o herramientas con las que </w:t>
-            </w:r>
-            <w:proofErr w:type="spellStart"/>
-            <w:r>
-              <w:rPr>
-                <w:b/>
-                <w:bCs/>
-                <w:i/>
-                <w:iCs/>
-              </w:rPr>
-              <w:t>trabajaria</w:t>
-            </w:r>
-            <w:proofErr w:type="spellEnd"/>
-            <w:r>
-              <w:rPr>
-                <w:b/>
-                <w:bCs/>
-                <w:i/>
-                <w:iCs/>
-              </w:rPr>
-              <w:t xml:space="preserve"> el equipo junior en sus primeros tres meses, y que tipo de proyectos suelen asignarse inicialmente?"</w:t>
-            </w:r>
-          </w:p>
-          <w:p>
-            <w:proofErr w:type="spellStart"/>
+              <w:t>"Cuales son las principales tecnologias o herramientas con las que trabajaria el equipo junior en sus primeros tres meses, y que tipo de proyectos suelen asignarse inicialmente?"</w:t>
+            </w:r>
+          </w:p>
+          <w:p>
             <w:r>
               <w:rPr>
                 <w:color w:val="666666"/>
                 <w:sz w:val="20"/>
                 <w:szCs w:val="20"/>
               </w:rPr>
-              <w:t>Justificacion</w:t>
-            </w:r>
-            <w:proofErr w:type="spellEnd"/>
-            <w:r>
-              <w:rPr>
-                <w:color w:val="666666"/>
-                <w:sz w:val="20"/>
-                <w:szCs w:val="20"/>
-              </w:rPr>
-              <w:t>: Me permite planificar mi curva de aprendizaje previa al ingreso y demostrar que me estoy preparando activamente para el rol.</w:t>
+              <w:t>Justificacion: Me permite planificar mi curva de aprendizaje previa al ingreso y demostrar que me estoy preparando activamente para el rol.</w:t>
             </w:r>
           </w:p>
         </w:tc>
@@ -2009,143 +1739,17 @@
                 <w:i/>
                 <w:iCs/>
               </w:rPr>
-              <w:t xml:space="preserve">"De </w:t>
-            </w:r>
-            <w:proofErr w:type="spellStart"/>
-            <w:r>
-              <w:rPr>
-                <w:b/>
-                <w:bCs/>
-                <w:i/>
-                <w:iCs/>
-              </w:rPr>
-              <w:t>que</w:t>
-            </w:r>
-            <w:proofErr w:type="spellEnd"/>
-            <w:r>
-              <w:rPr>
-                <w:b/>
-                <w:bCs/>
-                <w:i/>
-                <w:iCs/>
-              </w:rPr>
-              <w:t xml:space="preserve"> manera mide Google el impacto de los desarrolladores junior durante el primer </w:t>
-            </w:r>
-            <w:proofErr w:type="spellStart"/>
-            <w:r>
-              <w:rPr>
-                <w:b/>
-                <w:bCs/>
-                <w:i/>
-                <w:iCs/>
-              </w:rPr>
-              <w:t>ano</w:t>
-            </w:r>
-            <w:proofErr w:type="spellEnd"/>
-            <w:r>
-              <w:rPr>
-                <w:b/>
-                <w:bCs/>
-                <w:i/>
-                <w:iCs/>
-              </w:rPr>
-              <w:t xml:space="preserve">, y que </w:t>
-            </w:r>
-            <w:proofErr w:type="spellStart"/>
-            <w:r>
-              <w:rPr>
-                <w:b/>
-                <w:bCs/>
-                <w:i/>
-                <w:iCs/>
-              </w:rPr>
-              <w:t>metricas</w:t>
-            </w:r>
-            <w:proofErr w:type="spellEnd"/>
-            <w:r>
-              <w:rPr>
-                <w:b/>
-                <w:bCs/>
-                <w:i/>
-                <w:iCs/>
-              </w:rPr>
-              <w:t xml:space="preserve"> o indicadores se utilizan para evaluar el progreso </w:t>
-            </w:r>
-            <w:proofErr w:type="spellStart"/>
-            <w:r>
-              <w:rPr>
-                <w:b/>
-                <w:bCs/>
-                <w:i/>
-                <w:iCs/>
-              </w:rPr>
-              <w:t>tecnico</w:t>
-            </w:r>
-            <w:proofErr w:type="spellEnd"/>
-            <w:r>
-              <w:rPr>
-                <w:b/>
-                <w:bCs/>
-                <w:i/>
-                <w:iCs/>
-              </w:rPr>
-              <w:t xml:space="preserve"> y profesional?"</w:t>
-            </w:r>
-          </w:p>
-          <w:p>
-            <w:proofErr w:type="spellStart"/>
+              <w:t>"De que manera mide Google el impacto de los desarrolladores junior durante el primer ano, y que metricas o indicadores se utilizan para evaluar el progreso tecnico y profesional?"</w:t>
+            </w:r>
+          </w:p>
+          <w:p>
             <w:r>
               <w:rPr>
                 <w:color w:val="666666"/>
                 <w:sz w:val="20"/>
                 <w:szCs w:val="20"/>
               </w:rPr>
-              <w:t>Justificacion</w:t>
-            </w:r>
-            <w:proofErr w:type="spellEnd"/>
-            <w:r>
-              <w:rPr>
-                <w:color w:val="666666"/>
-                <w:sz w:val="20"/>
-                <w:szCs w:val="20"/>
-              </w:rPr>
-              <w:t xml:space="preserve">: Demuestra </w:t>
-            </w:r>
-            <w:proofErr w:type="spellStart"/>
-            <w:r>
-              <w:rPr>
-                <w:color w:val="666666"/>
-                <w:sz w:val="20"/>
-                <w:szCs w:val="20"/>
-              </w:rPr>
-              <w:t>orientacion</w:t>
-            </w:r>
-            <w:proofErr w:type="spellEnd"/>
-            <w:r>
-              <w:rPr>
-                <w:color w:val="666666"/>
-                <w:sz w:val="20"/>
-                <w:szCs w:val="20"/>
-              </w:rPr>
-              <w:t xml:space="preserve"> a resultados y </w:t>
-            </w:r>
-            <w:proofErr w:type="spellStart"/>
-            <w:r>
-              <w:rPr>
-                <w:color w:val="666666"/>
-                <w:sz w:val="20"/>
-                <w:szCs w:val="20"/>
-              </w:rPr>
-              <w:t>alineacion</w:t>
-            </w:r>
-            <w:proofErr w:type="spellEnd"/>
-            <w:r>
-              <w:rPr>
-                <w:color w:val="666666"/>
-                <w:sz w:val="20"/>
-                <w:szCs w:val="20"/>
-              </w:rPr>
-              <w:t xml:space="preserve"> con la cultura OKR de Google, evidenciando madurez profesional desde el inicio.</w:t>
+              <w:t>Justificacion: Demuestra orientacion a resultados y alineacion con la cultura OKR de Google, evidenciando madurez profesional desde el inicio.</w:t>
             </w:r>
           </w:p>
         </w:tc>
@@ -2536,25 +2140,7 @@
           <w:iCs/>
           <w:color w:val="888888"/>
         </w:rPr>
-        <w:t xml:space="preserve">Nota: Reemplazar los </w:t>
-      </w:r>
-      <w:proofErr w:type="spellStart"/>
-      <w:r>
-        <w:rPr>
-          <w:i/>
-          <w:iCs/>
-          <w:color w:val="888888"/>
-        </w:rPr>
-        <w:t>placeholders</w:t>
-      </w:r>
-      <w:proofErr w:type="spellEnd"/>
-      <w:r>
-        <w:rPr>
-          <w:i/>
-          <w:iCs/>
-          <w:color w:val="888888"/>
-        </w:rPr>
-        <w:t xml:space="preserve"> [tu-usuario] con el nombre de usuario real de GitHub y LinkedIn.</w:t>
+        <w:t>Nota: Reemplazar los placeholders [tu-usuario] con el nombre de usuario real de GitHub y LinkedIn.</w:t>
       </w:r>
     </w:p>
     <w:p>
@@ -2576,23 +2162,7 @@
         <w:jc w:val="both"/>
       </w:pPr>
       <w:r>
-        <w:t xml:space="preserve">El portafolio incluye los siguientes proyectos desarrollados durante la </w:t>
-      </w:r>
-      <w:proofErr w:type="spellStart"/>
-      <w:r>
-        <w:t>formacion</w:t>
-      </w:r>
-      <w:proofErr w:type="spellEnd"/>
-      <w:r>
-        <w:t xml:space="preserve">, que reflejan el recorrido </w:t>
-      </w:r>
-      <w:proofErr w:type="spellStart"/>
-      <w:r>
-        <w:t>tecnico</w:t>
-      </w:r>
-      <w:proofErr w:type="spellEnd"/>
-      <w:r>
-        <w:t xml:space="preserve"> y las habilidades adquiridas:</w:t>
+        <w:t>El portafolio incluye los siguientes proyectos desarrollados durante la formacion, que reflejan el recorrido tecnico y las habilidades adquiridas:</w:t>
       </w:r>
     </w:p>
     <w:p>
@@ -2717,7 +2287,6 @@
             <w:pPr>
               <w:jc w:val="center"/>
             </w:pPr>
-            <w:proofErr w:type="spellStart"/>
             <w:r>
               <w:rPr>
                 <w:b/>
@@ -2728,7 +2297,6 @@
               </w:rPr>
               <w:t>Descripcion</w:t>
             </w:r>
-            <w:proofErr w:type="spellEnd"/>
           </w:p>
         </w:tc>
         <w:tc>
@@ -2753,7 +2321,6 @@
             <w:pPr>
               <w:jc w:val="center"/>
             </w:pPr>
-            <w:proofErr w:type="spellStart"/>
             <w:r>
               <w:rPr>
                 <w:b/>
@@ -2764,7 +2331,6 @@
               </w:rPr>
               <w:t>Tecnologias</w:t>
             </w:r>
-            <w:proofErr w:type="spellEnd"/>
           </w:p>
         </w:tc>
       </w:tr>
@@ -2862,16 +2428,7 @@
           </w:tcPr>
           <w:p>
             <w:r>
-              <w:t>Aplicación</w:t>
-            </w:r>
-            <w:r>
-              <w:t xml:space="preserve"> web para el registro y control de inventario de materiales en planta industrial. Incluye CRUD completo, </w:t>
-            </w:r>
-            <w:r>
-              <w:t>autenticación</w:t>
-            </w:r>
-            <w:r>
-              <w:t xml:space="preserve"> y reportes exportables.</w:t>
+              <w:t>Aplicación web para el registro y control de inventario de materiales en planta industrial. Incluye CRUD completo, autenticación y reportes exportables.</w:t>
             </w:r>
           </w:p>
         </w:tc>
@@ -2967,23 +2524,7 @@
                 <w:b/>
                 <w:bCs/>
               </w:rPr>
-              <w:t xml:space="preserve">API </w:t>
-            </w:r>
-            <w:proofErr w:type="spellStart"/>
-            <w:r>
-              <w:rPr>
-                <w:b/>
-                <w:bCs/>
-              </w:rPr>
-              <w:t>RESTful</w:t>
-            </w:r>
-            <w:proofErr w:type="spellEnd"/>
-            <w:r>
-              <w:rPr>
-                <w:b/>
-                <w:bCs/>
-              </w:rPr>
-              <w:t xml:space="preserve"> para monitoreo de procesos</w:t>
+              <w:t>API RESTful para monitoreo de procesos</w:t>
             </w:r>
           </w:p>
         </w:tc>
@@ -3006,21 +2547,8 @@
             <w:vAlign w:val="center"/>
           </w:tcPr>
           <w:p>
-            <w:proofErr w:type="spellStart"/>
-            <w:r>
-              <w:t>Backend</w:t>
-            </w:r>
-            <w:proofErr w:type="spellEnd"/>
-            <w:r>
-              <w:t xml:space="preserve"> que expone </w:t>
-            </w:r>
-            <w:proofErr w:type="spellStart"/>
-            <w:r>
-              <w:t>endpoints</w:t>
-            </w:r>
-            <w:proofErr w:type="spellEnd"/>
-            <w:r>
-              <w:t xml:space="preserve"> para registrar y consultar variables de proceso (temperatura, </w:t>
+            <w:r>
+              <w:t xml:space="preserve">Backend que expone endpoints para registrar y consultar variables de proceso (temperatura, </w:t>
             </w:r>
             <w:r>
               <w:t>presión</w:t>
@@ -3032,15 +2560,7 @@
               <w:t>documentación</w:t>
             </w:r>
             <w:r>
-              <w:t xml:space="preserve"> con </w:t>
-            </w:r>
-            <w:proofErr w:type="spellStart"/>
-            <w:r>
-              <w:t>Swagger</w:t>
-            </w:r>
-            <w:proofErr w:type="spellEnd"/>
-            <w:r>
-              <w:t>.</w:t>
+              <w:t xml:space="preserve"> con Swagger.</w:t>
             </w:r>
           </w:p>
         </w:tc>
@@ -3075,9 +2595,133 @@
                 <w:color w:val="555555"/>
                 <w:lang w:val="en-US"/>
               </w:rPr>
-              <w:t xml:space="preserve">Python, </w:t>
-            </w:r>
-            <w:proofErr w:type="spellStart"/>
+              <w:t>Python, FastAPI, SQLite, Swagger/OpenAPI</w:t>
+            </w:r>
+          </w:p>
+        </w:tc>
+      </w:tr>
+      <w:tr>
+        <w:tc>
+          <w:tcPr>
+            <w:tcW w:w="480" w:type="dxa"/>
+            <w:tcBorders>
+              <w:top w:val="single" w:sz="4" w:space="0" w:color="CCCCCC"/>
+              <w:left w:val="single" w:sz="4" w:space="0" w:color="CCCCCC"/>
+              <w:bottom w:val="single" w:sz="4" w:space="0" w:color="CCCCCC"/>
+              <w:right w:val="single" w:sz="4" w:space="0" w:color="CCCCCC"/>
+            </w:tcBorders>
+            <w:shd w:val="clear" w:color="auto" w:fill="F5F5F5"/>
+            <w:tcMar>
+              <w:top w:w="100" w:type="dxa"/>
+              <w:left w:w="140" w:type="dxa"/>
+              <w:bottom w:w="100" w:type="dxa"/>
+              <w:right w:w="140" w:type="dxa"/>
+            </w:tcMar>
+            <w:vAlign w:val="center"/>
+          </w:tcPr>
+          <w:p>
+            <w:pPr>
+              <w:jc w:val="center"/>
+            </w:pPr>
+            <w:r>
+              <w:rPr>
+                <w:b/>
+                <w:bCs/>
+              </w:rPr>
+              <w:t>3</w:t>
+            </w:r>
+          </w:p>
+        </w:tc>
+        <w:tc>
+          <w:tcPr>
+            <w:tcW w:w="2800" w:type="dxa"/>
+            <w:tcBorders>
+              <w:top w:val="single" w:sz="4" w:space="0" w:color="CCCCCC"/>
+              <w:left w:val="single" w:sz="4" w:space="0" w:color="CCCCCC"/>
+              <w:bottom w:val="single" w:sz="4" w:space="0" w:color="CCCCCC"/>
+              <w:right w:val="single" w:sz="4" w:space="0" w:color="CCCCCC"/>
+            </w:tcBorders>
+            <w:shd w:val="clear" w:color="auto" w:fill="FFFFFF"/>
+            <w:tcMar>
+              <w:top w:w="100" w:type="dxa"/>
+              <w:left w:w="140" w:type="dxa"/>
+              <w:bottom w:w="100" w:type="dxa"/>
+              <w:right w:w="140" w:type="dxa"/>
+            </w:tcMar>
+            <w:vAlign w:val="center"/>
+          </w:tcPr>
+          <w:p>
+            <w:r>
+              <w:rPr>
+                <w:b/>
+                <w:bCs/>
+              </w:rPr>
+              <w:t xml:space="preserve">Dashboard de </w:t>
+            </w:r>
+            <w:r>
+              <w:rPr>
+                <w:b/>
+                <w:bCs/>
+              </w:rPr>
+              <w:t>análisis</w:t>
+            </w:r>
+            <w:r>
+              <w:rPr>
+                <w:b/>
+                <w:bCs/>
+              </w:rPr>
+              <w:t xml:space="preserve"> de datos con Python</w:t>
+            </w:r>
+          </w:p>
+        </w:tc>
+        <w:tc>
+          <w:tcPr>
+            <w:tcW w:w="3400" w:type="dxa"/>
+            <w:tcBorders>
+              <w:top w:val="single" w:sz="4" w:space="0" w:color="CCCCCC"/>
+              <w:left w:val="single" w:sz="4" w:space="0" w:color="CCCCCC"/>
+              <w:bottom w:val="single" w:sz="4" w:space="0" w:color="CCCCCC"/>
+              <w:right w:val="single" w:sz="4" w:space="0" w:color="CCCCCC"/>
+            </w:tcBorders>
+            <w:shd w:val="clear" w:color="auto" w:fill="FFFFFF"/>
+            <w:tcMar>
+              <w:top w:w="100" w:type="dxa"/>
+              <w:left w:w="140" w:type="dxa"/>
+              <w:bottom w:w="100" w:type="dxa"/>
+              <w:right w:w="140" w:type="dxa"/>
+            </w:tcMar>
+            <w:vAlign w:val="center"/>
+          </w:tcPr>
+          <w:p>
+            <w:r>
+              <w:t>Herramienta de visualizacion interactiva para analizar datasets de produccion industrial, identificar tendencias y exportar reportes automatizados.</w:t>
+            </w:r>
+          </w:p>
+        </w:tc>
+        <w:tc>
+          <w:tcPr>
+            <w:tcW w:w="3400" w:type="dxa"/>
+            <w:tcBorders>
+              <w:top w:val="single" w:sz="4" w:space="0" w:color="CCCCCC"/>
+              <w:left w:val="single" w:sz="4" w:space="0" w:color="CCCCCC"/>
+              <w:bottom w:val="single" w:sz="4" w:space="0" w:color="CCCCCC"/>
+              <w:right w:val="single" w:sz="4" w:space="0" w:color="CCCCCC"/>
+            </w:tcBorders>
+            <w:shd w:val="clear" w:color="auto" w:fill="FFFFFF"/>
+            <w:tcMar>
+              <w:top w:w="100" w:type="dxa"/>
+              <w:left w:w="140" w:type="dxa"/>
+              <w:bottom w:w="100" w:type="dxa"/>
+              <w:right w:w="140" w:type="dxa"/>
+            </w:tcMar>
+            <w:vAlign w:val="center"/>
+          </w:tcPr>
+          <w:p>
+            <w:pPr>
+              <w:rPr>
+                <w:lang w:val="en-US"/>
+              </w:rPr>
+            </w:pPr>
             <w:r>
               <w:rPr>
                 <w:i/>
@@ -3085,215 +2729,7 @@
                 <w:color w:val="555555"/>
                 <w:lang w:val="en-US"/>
               </w:rPr>
-              <w:t>FastAPI</w:t>
-            </w:r>
-            <w:proofErr w:type="spellEnd"/>
-            <w:r>
-              <w:rPr>
-                <w:i/>
-                <w:iCs/>
-                <w:color w:val="555555"/>
-                <w:lang w:val="en-US"/>
-              </w:rPr>
-              <w:t>, SQLite, Swagger/</w:t>
-            </w:r>
-            <w:proofErr w:type="spellStart"/>
-            <w:r>
-              <w:rPr>
-                <w:i/>
-                <w:iCs/>
-                <w:color w:val="555555"/>
-                <w:lang w:val="en-US"/>
-              </w:rPr>
-              <w:t>OpenAPI</w:t>
-            </w:r>
-            <w:proofErr w:type="spellEnd"/>
-          </w:p>
-        </w:tc>
-      </w:tr>
-      <w:tr>
-        <w:tc>
-          <w:tcPr>
-            <w:tcW w:w="480" w:type="dxa"/>
-            <w:tcBorders>
-              <w:top w:val="single" w:sz="4" w:space="0" w:color="CCCCCC"/>
-              <w:left w:val="single" w:sz="4" w:space="0" w:color="CCCCCC"/>
-              <w:bottom w:val="single" w:sz="4" w:space="0" w:color="CCCCCC"/>
-              <w:right w:val="single" w:sz="4" w:space="0" w:color="CCCCCC"/>
-            </w:tcBorders>
-            <w:shd w:val="clear" w:color="auto" w:fill="F5F5F5"/>
-            <w:tcMar>
-              <w:top w:w="100" w:type="dxa"/>
-              <w:left w:w="140" w:type="dxa"/>
-              <w:bottom w:w="100" w:type="dxa"/>
-              <w:right w:w="140" w:type="dxa"/>
-            </w:tcMar>
-            <w:vAlign w:val="center"/>
-          </w:tcPr>
-          <w:p>
-            <w:pPr>
-              <w:jc w:val="center"/>
-            </w:pPr>
-            <w:r>
-              <w:rPr>
-                <w:b/>
-                <w:bCs/>
-              </w:rPr>
-              <w:t>3</w:t>
-            </w:r>
-          </w:p>
-        </w:tc>
-        <w:tc>
-          <w:tcPr>
-            <w:tcW w:w="2800" w:type="dxa"/>
-            <w:tcBorders>
-              <w:top w:val="single" w:sz="4" w:space="0" w:color="CCCCCC"/>
-              <w:left w:val="single" w:sz="4" w:space="0" w:color="CCCCCC"/>
-              <w:bottom w:val="single" w:sz="4" w:space="0" w:color="CCCCCC"/>
-              <w:right w:val="single" w:sz="4" w:space="0" w:color="CCCCCC"/>
-            </w:tcBorders>
-            <w:shd w:val="clear" w:color="auto" w:fill="FFFFFF"/>
-            <w:tcMar>
-              <w:top w:w="100" w:type="dxa"/>
-              <w:left w:w="140" w:type="dxa"/>
-              <w:bottom w:w="100" w:type="dxa"/>
-              <w:right w:w="140" w:type="dxa"/>
-            </w:tcMar>
-            <w:vAlign w:val="center"/>
-          </w:tcPr>
-          <w:p>
-            <w:proofErr w:type="spellStart"/>
-            <w:r>
-              <w:rPr>
-                <w:b/>
-                <w:bCs/>
-              </w:rPr>
-              <w:t>Dashboard</w:t>
-            </w:r>
-            <w:proofErr w:type="spellEnd"/>
-            <w:r>
-              <w:rPr>
-                <w:b/>
-                <w:bCs/>
-              </w:rPr>
-              <w:t xml:space="preserve"> de </w:t>
-            </w:r>
-            <w:r>
-              <w:rPr>
-                <w:b/>
-                <w:bCs/>
-              </w:rPr>
-              <w:t>análisis</w:t>
-            </w:r>
-            <w:r>
-              <w:rPr>
-                <w:b/>
-                <w:bCs/>
-              </w:rPr>
-              <w:t xml:space="preserve"> de datos con Python</w:t>
-            </w:r>
-          </w:p>
-        </w:tc>
-        <w:tc>
-          <w:tcPr>
-            <w:tcW w:w="3400" w:type="dxa"/>
-            <w:tcBorders>
-              <w:top w:val="single" w:sz="4" w:space="0" w:color="CCCCCC"/>
-              <w:left w:val="single" w:sz="4" w:space="0" w:color="CCCCCC"/>
-              <w:bottom w:val="single" w:sz="4" w:space="0" w:color="CCCCCC"/>
-              <w:right w:val="single" w:sz="4" w:space="0" w:color="CCCCCC"/>
-            </w:tcBorders>
-            <w:shd w:val="clear" w:color="auto" w:fill="FFFFFF"/>
-            <w:tcMar>
-              <w:top w:w="100" w:type="dxa"/>
-              <w:left w:w="140" w:type="dxa"/>
-              <w:bottom w:w="100" w:type="dxa"/>
-              <w:right w:w="140" w:type="dxa"/>
-            </w:tcMar>
-            <w:vAlign w:val="center"/>
-          </w:tcPr>
-          <w:p>
-            <w:r>
-              <w:t xml:space="preserve">Herramienta de </w:t>
-            </w:r>
-            <w:proofErr w:type="spellStart"/>
-            <w:r>
-              <w:t>visualizacion</w:t>
-            </w:r>
-            <w:proofErr w:type="spellEnd"/>
-            <w:r>
-              <w:t xml:space="preserve"> interactiva para analizar </w:t>
-            </w:r>
-            <w:proofErr w:type="spellStart"/>
-            <w:r>
-              <w:t>datasets</w:t>
-            </w:r>
-            <w:proofErr w:type="spellEnd"/>
-            <w:r>
-              <w:t xml:space="preserve"> de </w:t>
-            </w:r>
-            <w:proofErr w:type="spellStart"/>
-            <w:r>
-              <w:t>produccion</w:t>
-            </w:r>
-            <w:proofErr w:type="spellEnd"/>
-            <w:r>
-              <w:t xml:space="preserve"> industrial, identificar tendencias y exportar reportes automatizados.</w:t>
-            </w:r>
-          </w:p>
-        </w:tc>
-        <w:tc>
-          <w:tcPr>
-            <w:tcW w:w="3400" w:type="dxa"/>
-            <w:tcBorders>
-              <w:top w:val="single" w:sz="4" w:space="0" w:color="CCCCCC"/>
-              <w:left w:val="single" w:sz="4" w:space="0" w:color="CCCCCC"/>
-              <w:bottom w:val="single" w:sz="4" w:space="0" w:color="CCCCCC"/>
-              <w:right w:val="single" w:sz="4" w:space="0" w:color="CCCCCC"/>
-            </w:tcBorders>
-            <w:shd w:val="clear" w:color="auto" w:fill="FFFFFF"/>
-            <w:tcMar>
-              <w:top w:w="100" w:type="dxa"/>
-              <w:left w:w="140" w:type="dxa"/>
-              <w:bottom w:w="100" w:type="dxa"/>
-              <w:right w:w="140" w:type="dxa"/>
-            </w:tcMar>
-            <w:vAlign w:val="center"/>
-          </w:tcPr>
-          <w:p>
-            <w:pPr>
-              <w:rPr>
-                <w:lang w:val="en-US"/>
-              </w:rPr>
-            </w:pPr>
-            <w:r>
-              <w:rPr>
-                <w:i/>
-                <w:iCs/>
-                <w:color w:val="555555"/>
-                <w:lang w:val="en-US"/>
-              </w:rPr>
-              <w:t xml:space="preserve">Python, Pandas, Matplotlib, </w:t>
-            </w:r>
-            <w:proofErr w:type="spellStart"/>
-            <w:r>
-              <w:rPr>
-                <w:i/>
-                <w:iCs/>
-                <w:color w:val="555555"/>
-                <w:lang w:val="en-US"/>
-              </w:rPr>
-              <w:t>Streamlit</w:t>
-            </w:r>
-            <w:proofErr w:type="spellEnd"/>
-            <w:r>
-              <w:rPr>
-                <w:i/>
-                <w:iCs/>
-                <w:color w:val="555555"/>
-                <w:lang w:val="en-US"/>
-              </w:rPr>
-              <w:t>, Excel/CSV</w:t>
+              <w:t>Python, Pandas, Matplotlib, Streamlit, Excel/CSV</w:t>
             </w:r>
           </w:p>
         </w:tc>
@@ -3312,15 +2748,7 @@
         <w:pStyle w:val="Ttulo2"/>
       </w:pPr>
       <w:r>
-        <w:t xml:space="preserve">2.3 Caso de estudio: API </w:t>
-      </w:r>
-      <w:proofErr w:type="spellStart"/>
-      <w:r>
-        <w:t>RESTful</w:t>
-      </w:r>
-      <w:proofErr w:type="spellEnd"/>
-      <w:r>
-        <w:t xml:space="preserve"> para monitoreo de procesos industriales</w:t>
+        <w:t>2.3 Caso de estudio: API RESTful para monitoreo de procesos industriales</w:t>
       </w:r>
     </w:p>
     <w:p>
@@ -3330,71 +2758,7 @@
       </w:pPr>
       <w:r>
         <w:lastRenderedPageBreak/>
-        <w:t xml:space="preserve">A </w:t>
-      </w:r>
-      <w:proofErr w:type="spellStart"/>
-      <w:r>
-        <w:t>continuacion</w:t>
-      </w:r>
-      <w:proofErr w:type="spellEnd"/>
-      <w:r>
-        <w:t xml:space="preserve"> se presenta el contenido del caso de estudio seleccionado, equivalente al archivo README.md disponible en el repositorio de GitHub. Este proyecto fue elegido por representar la </w:t>
-      </w:r>
-      <w:proofErr w:type="spellStart"/>
-      <w:r>
-        <w:t>integracion</w:t>
-      </w:r>
-      <w:proofErr w:type="spellEnd"/>
-      <w:r>
-        <w:t xml:space="preserve"> </w:t>
-      </w:r>
-      <w:proofErr w:type="spellStart"/>
-      <w:r>
-        <w:t>mas</w:t>
-      </w:r>
-      <w:proofErr w:type="spellEnd"/>
-      <w:r>
-        <w:t xml:space="preserve"> significativa entre la </w:t>
-      </w:r>
-      <w:proofErr w:type="spellStart"/>
-      <w:r>
-        <w:t>formacion</w:t>
-      </w:r>
-      <w:proofErr w:type="spellEnd"/>
-      <w:r>
-        <w:t xml:space="preserve"> en </w:t>
-      </w:r>
-      <w:proofErr w:type="spellStart"/>
-      <w:r>
-        <w:t>ingenieria</w:t>
-      </w:r>
-      <w:proofErr w:type="spellEnd"/>
-      <w:r>
-        <w:t xml:space="preserve"> </w:t>
-      </w:r>
-      <w:proofErr w:type="spellStart"/>
-      <w:r>
-        <w:t>quimica</w:t>
-      </w:r>
-      <w:proofErr w:type="spellEnd"/>
-      <w:r>
-        <w:t xml:space="preserve"> y las habilidades adquiridas en el </w:t>
-      </w:r>
-      <w:proofErr w:type="spellStart"/>
-      <w:r>
-        <w:t>bootcamp</w:t>
-      </w:r>
-      <w:proofErr w:type="spellEnd"/>
-      <w:r>
-        <w:t xml:space="preserve"> de </w:t>
-      </w:r>
-      <w:proofErr w:type="spellStart"/>
-      <w:r>
-        <w:t>tecnologia</w:t>
-      </w:r>
-      <w:proofErr w:type="spellEnd"/>
-      <w:r>
-        <w:t>.</w:t>
+        <w:t>A continuacion se presenta el contenido del caso de estudio seleccionado, equivalente al archivo README.md disponible en el repositorio de GitHub. Este proyecto fue elegido por representar la integracion mas significativa entre la formacion en ingenieria quimica y las habilidades adquiridas en el bootcamp de tecnologia.</w:t>
       </w:r>
     </w:p>
     <w:p>
@@ -3458,7 +2822,6 @@
             </w:pPr>
           </w:p>
           <w:p>
-            <w:proofErr w:type="spellStart"/>
             <w:r>
               <w:rPr>
                 <w:b/>
@@ -3467,9 +2830,20 @@
                 <w:sz w:val="24"/>
                 <w:szCs w:val="24"/>
               </w:rPr>
-              <w:t>Descripcion</w:t>
-            </w:r>
-            <w:proofErr w:type="spellEnd"/>
+              <w:t>Descripcion de la actividad</w:t>
+            </w:r>
+          </w:p>
+          <w:p>
+            <w:r>
+              <w:t>Desarrollo de una API RESTful con Python y FastAPI para registrar, consultar y visualizar variables de proceso en tiempo real en un contexto de planta industrial simulada. El proyecto integra conocimientos de backend, bases de datos relacionales y documentacion tecnica con Swagger.</w:t>
+            </w:r>
+          </w:p>
+          <w:p>
+            <w:pPr>
+              <w:spacing w:before="80" w:after="80"/>
+            </w:pPr>
+          </w:p>
+          <w:p>
             <w:r>
               <w:rPr>
                 <w:b/>
@@ -3478,60 +2852,12 @@
                 <w:sz w:val="24"/>
                 <w:szCs w:val="24"/>
               </w:rPr>
-              <w:t xml:space="preserve"> de la actividad</w:t>
-            </w:r>
-          </w:p>
-          <w:p>
-            <w:r>
-              <w:t xml:space="preserve">Desarrollo de una API </w:t>
-            </w:r>
-            <w:proofErr w:type="spellStart"/>
-            <w:r>
-              <w:t>RESTful</w:t>
-            </w:r>
-            <w:proofErr w:type="spellEnd"/>
-            <w:r>
-              <w:t xml:space="preserve"> con Python y </w:t>
-            </w:r>
-            <w:proofErr w:type="spellStart"/>
-            <w:r>
-              <w:t>FastAPI</w:t>
-            </w:r>
-            <w:proofErr w:type="spellEnd"/>
-            <w:r>
-              <w:t xml:space="preserve"> para registrar, consultar y visualizar variables de proceso en tiempo real en un contexto de planta industrial simulada. El proyecto integra conocimientos de </w:t>
-            </w:r>
-            <w:proofErr w:type="spellStart"/>
-            <w:r>
-              <w:t>backend</w:t>
-            </w:r>
-            <w:proofErr w:type="spellEnd"/>
-            <w:r>
-              <w:t xml:space="preserve">, bases de datos relacionales y </w:t>
-            </w:r>
-            <w:proofErr w:type="spellStart"/>
-            <w:r>
-              <w:t>documentacion</w:t>
-            </w:r>
-            <w:proofErr w:type="spellEnd"/>
-            <w:r>
-              <w:t xml:space="preserve"> </w:t>
-            </w:r>
-            <w:proofErr w:type="spellStart"/>
-            <w:r>
-              <w:t>tecnica</w:t>
-            </w:r>
-            <w:proofErr w:type="spellEnd"/>
-            <w:r>
-              <w:t xml:space="preserve"> con </w:t>
-            </w:r>
-            <w:proofErr w:type="spellStart"/>
-            <w:r>
-              <w:t>Swagger</w:t>
-            </w:r>
-            <w:proofErr w:type="spellEnd"/>
-            <w:r>
-              <w:t>.</w:t>
+              <w:t>Desafio principal</w:t>
+            </w:r>
+          </w:p>
+          <w:p>
+            <w:r>
+              <w:t>El mayor desafio fue disenar una arquitectura de datos flexible que pudiera representar diferentes tipos de variables de proceso (continuas, discretas, booleanas) sin duplicar logica de negocio. Tambien fue necesario implementar autenticacion segura y documentacion automatica para que otros equipos pudieran consumir la API sin friccion.</w:t>
             </w:r>
           </w:p>
           <w:p>
@@ -3540,7 +2866,6 @@
             </w:pPr>
           </w:p>
           <w:p>
-            <w:proofErr w:type="spellStart"/>
             <w:r>
               <w:rPr>
                 <w:b/>
@@ -3549,9 +2874,20 @@
                 <w:sz w:val="24"/>
                 <w:szCs w:val="24"/>
               </w:rPr>
-              <w:t>Desafio</w:t>
-            </w:r>
-            <w:proofErr w:type="spellEnd"/>
+              <w:t>Solucion propuesta</w:t>
+            </w:r>
+          </w:p>
+          <w:p>
+            <w:r>
+              <w:t>Se implemento una API REST con FastAPI siguiendo principios de diseno RESTful (verbos HTTP, codigos de estado, separacion por recursos). Se utilizo SQLite como base de datos liviana, con SQLAlchemy como ORM para abstraer las consultas. La autenticacion se resolvio con OAuth2 + JWT. La documentacion se genero automaticamente con Swagger UI integrado en FastAPI.</w:t>
+            </w:r>
+          </w:p>
+          <w:p>
+            <w:pPr>
+              <w:spacing w:before="80" w:after="80"/>
+            </w:pPr>
+          </w:p>
+          <w:p>
             <w:r>
               <w:rPr>
                 <w:b/>
@@ -3560,76 +2896,12 @@
                 <w:sz w:val="24"/>
                 <w:szCs w:val="24"/>
               </w:rPr>
-              <w:t xml:space="preserve"> principal</w:t>
-            </w:r>
-          </w:p>
-          <w:p>
-            <w:r>
-              <w:t xml:space="preserve">El mayor </w:t>
-            </w:r>
-            <w:proofErr w:type="spellStart"/>
-            <w:r>
-              <w:t>desafio</w:t>
-            </w:r>
-            <w:proofErr w:type="spellEnd"/>
-            <w:r>
-              <w:t xml:space="preserve"> fue </w:t>
-            </w:r>
-            <w:proofErr w:type="spellStart"/>
-            <w:r>
-              <w:t>disenar</w:t>
-            </w:r>
-            <w:proofErr w:type="spellEnd"/>
-            <w:r>
-              <w:t xml:space="preserve"> una arquitectura de datos flexible que pudiera representar diferentes tipos de variables de proceso (continuas, discretas, booleanas) sin duplicar </w:t>
-            </w:r>
-            <w:proofErr w:type="spellStart"/>
-            <w:r>
-              <w:t>logica</w:t>
-            </w:r>
-            <w:proofErr w:type="spellEnd"/>
-            <w:r>
-              <w:t xml:space="preserve"> de negocio. </w:t>
-            </w:r>
-            <w:proofErr w:type="spellStart"/>
-            <w:r>
-              <w:t>Tambien</w:t>
-            </w:r>
-            <w:proofErr w:type="spellEnd"/>
-            <w:r>
-              <w:t xml:space="preserve"> fue necesario implementar </w:t>
-            </w:r>
-            <w:proofErr w:type="spellStart"/>
-            <w:r>
-              <w:t>autenticacion</w:t>
-            </w:r>
-            <w:proofErr w:type="spellEnd"/>
-            <w:r>
-              <w:t xml:space="preserve"> segura y </w:t>
-            </w:r>
-            <w:proofErr w:type="spellStart"/>
-            <w:r>
-              <w:t>documentacion</w:t>
-            </w:r>
-            <w:proofErr w:type="spellEnd"/>
-            <w:r>
-              <w:t xml:space="preserve"> </w:t>
-            </w:r>
-            <w:proofErr w:type="spellStart"/>
-            <w:r>
-              <w:t>automatica</w:t>
-            </w:r>
-            <w:proofErr w:type="spellEnd"/>
-            <w:r>
-              <w:t xml:space="preserve"> para que otros equipos pudieran consumir la API sin </w:t>
-            </w:r>
-            <w:proofErr w:type="spellStart"/>
-            <w:r>
-              <w:t>friccion</w:t>
-            </w:r>
-            <w:proofErr w:type="spellEnd"/>
-            <w:r>
-              <w:t>.</w:t>
+              <w:t>Herramienta tecnica utilizada</w:t>
+            </w:r>
+          </w:p>
+          <w:p>
+            <w:r>
+              <w:t>FastAPI (Python): framework moderno de alto rendimiento para construir APIs con validacion automatica via Pydantic, documentacion Swagger/OpenAPI integrada y soporte nativo para operaciones asincronas. Se eligio sobre Flask por su velocidad de desarrollo, tipado estatico y generacion automatica de docs.</w:t>
             </w:r>
           </w:p>
           <w:p>
@@ -3638,7 +2910,6 @@
             </w:pPr>
           </w:p>
           <w:p>
-            <w:proofErr w:type="spellStart"/>
             <w:r>
               <w:rPr>
                 <w:b/>
@@ -3647,9 +2918,40 @@
                 <w:sz w:val="24"/>
                 <w:szCs w:val="24"/>
               </w:rPr>
-              <w:t>Solucion</w:t>
-            </w:r>
-            <w:proofErr w:type="spellEnd"/>
+              <w:t>Principales aprendizajes</w:t>
+            </w:r>
+          </w:p>
+          <w:p>
+            <w:r>
+              <w:t>- Comprension profunda del ciclo de vida de una solicitud HTTP y el diseno de endpoints REST.</w:t>
+            </w:r>
+          </w:p>
+          <w:p>
+            <w:r>
+              <w:t>- Uso de ORMs para abstraer la capa de datos y mejorar la mantenibilidad.</w:t>
+            </w:r>
+          </w:p>
+          <w:p>
+            <w:r>
+              <w:t>- Implementacion de autenticacion segura con tokens JWT.</w:t>
+            </w:r>
+          </w:p>
+          <w:p>
+            <w:r>
+              <w:t>- Valor de la documentacion tecnica automatica para facilitar la colaboracion entre equipos.</w:t>
+            </w:r>
+          </w:p>
+          <w:p>
+            <w:r>
+              <w:t>- Integracion entre conocimiento de dominio (procesos industriales) y soluciones de software.</w:t>
+            </w:r>
+          </w:p>
+          <w:p>
+            <w:pPr>
+              <w:spacing w:before="80" w:after="80"/>
+            </w:pPr>
+          </w:p>
+          <w:p>
             <w:r>
               <w:rPr>
                 <w:b/>
@@ -3658,116 +2960,27 @@
                 <w:sz w:val="24"/>
                 <w:szCs w:val="24"/>
               </w:rPr>
-              <w:t xml:space="preserve"> propuesta</w:t>
-            </w:r>
-          </w:p>
-          <w:p>
-            <w:r>
-              <w:t xml:space="preserve">Se implemento una API REST con </w:t>
-            </w:r>
-            <w:proofErr w:type="spellStart"/>
-            <w:r>
-              <w:t>FastAPI</w:t>
-            </w:r>
-            <w:proofErr w:type="spellEnd"/>
-            <w:r>
-              <w:t xml:space="preserve"> siguiendo principios de </w:t>
-            </w:r>
-            <w:proofErr w:type="spellStart"/>
-            <w:r>
-              <w:t>diseno</w:t>
-            </w:r>
-            <w:proofErr w:type="spellEnd"/>
-            <w:r>
-              <w:t xml:space="preserve"> </w:t>
-            </w:r>
-            <w:proofErr w:type="spellStart"/>
-            <w:r>
-              <w:t>RESTful</w:t>
-            </w:r>
-            <w:proofErr w:type="spellEnd"/>
-            <w:r>
-              <w:t xml:space="preserve"> (verbos HTTP, </w:t>
-            </w:r>
-            <w:proofErr w:type="spellStart"/>
-            <w:r>
-              <w:t>codigos</w:t>
-            </w:r>
-            <w:proofErr w:type="spellEnd"/>
-            <w:r>
-              <w:t xml:space="preserve"> de estado, </w:t>
-            </w:r>
-            <w:proofErr w:type="spellStart"/>
-            <w:r>
-              <w:t>separacion</w:t>
-            </w:r>
-            <w:proofErr w:type="spellEnd"/>
-            <w:r>
-              <w:t xml:space="preserve"> por recursos). Se utilizo SQLite como base de datos liviana, con </w:t>
-            </w:r>
-            <w:proofErr w:type="spellStart"/>
-            <w:r>
-              <w:t>SQLAlchemy</w:t>
-            </w:r>
-            <w:proofErr w:type="spellEnd"/>
-            <w:r>
-              <w:t xml:space="preserve"> como ORM para abstraer las consultas. La </w:t>
-            </w:r>
-            <w:proofErr w:type="spellStart"/>
-            <w:r>
-              <w:t>autenticacion</w:t>
-            </w:r>
-            <w:proofErr w:type="spellEnd"/>
-            <w:r>
-              <w:t xml:space="preserve"> se </w:t>
-            </w:r>
-            <w:proofErr w:type="spellStart"/>
-            <w:r>
-              <w:t>resolvio</w:t>
-            </w:r>
-            <w:proofErr w:type="spellEnd"/>
-            <w:r>
-              <w:t xml:space="preserve"> con OAuth2 + JWT. La </w:t>
-            </w:r>
-            <w:proofErr w:type="spellStart"/>
-            <w:r>
-              <w:t>documentacion</w:t>
-            </w:r>
-            <w:proofErr w:type="spellEnd"/>
-            <w:r>
-              <w:t xml:space="preserve"> se </w:t>
-            </w:r>
-            <w:proofErr w:type="spellStart"/>
-            <w:r>
-              <w:t>genero</w:t>
-            </w:r>
-            <w:proofErr w:type="spellEnd"/>
-            <w:r>
-              <w:t xml:space="preserve"> </w:t>
-            </w:r>
-            <w:proofErr w:type="spellStart"/>
-            <w:r>
-              <w:t>automaticamente</w:t>
-            </w:r>
-            <w:proofErr w:type="spellEnd"/>
-            <w:r>
-              <w:t xml:space="preserve"> con </w:t>
-            </w:r>
-            <w:proofErr w:type="spellStart"/>
-            <w:r>
-              <w:t>Swagger</w:t>
-            </w:r>
-            <w:proofErr w:type="spellEnd"/>
-            <w:r>
-              <w:t xml:space="preserve"> UI integrado en </w:t>
-            </w:r>
-            <w:proofErr w:type="spellStart"/>
-            <w:r>
-              <w:t>FastAPI</w:t>
-            </w:r>
-            <w:proofErr w:type="spellEnd"/>
-            <w:r>
-              <w:t>.</w:t>
+              <w:t>Metricas de impacto logradas</w:t>
+            </w:r>
+          </w:p>
+          <w:p>
+            <w:r>
+              <w:t>- Tiempo de respuesta promedio del endpoint: &lt; 80 ms bajo carga simulada.</w:t>
+            </w:r>
+          </w:p>
+          <w:p>
+            <w:r>
+              <w:t>- Cobertura de endpoints documentados: 100% via Swagger UI.</w:t>
+            </w:r>
+          </w:p>
+          <w:p>
+            <w:r>
+              <w:t>- Reduccion del tiempo de onboarding para consumir la API: de 2 horas a 20 minutos gracias a la documentacion automatica.</w:t>
+            </w:r>
+          </w:p>
+          <w:p>
+            <w:r>
+              <w:t>- 0 vulnerabilidades de autenticacion detectadas en revision de pares.</w:t>
             </w:r>
           </w:p>
           <w:p>
@@ -3784,9 +2997,24 @@
                 <w:sz w:val="24"/>
                 <w:szCs w:val="24"/>
               </w:rPr>
-              <w:t xml:space="preserve">Herramienta </w:t>
-            </w:r>
-            <w:proofErr w:type="spellStart"/>
+              <w:t>Habilidades tecnicas aplicadas</w:t>
+            </w:r>
+          </w:p>
+          <w:p>
+            <w:r>
+              <w:rPr>
+                <w:color w:val="333333"/>
+              </w:rPr>
+              <w:lastRenderedPageBreak/>
+              <w:t>Python | FastAPI | SQLAlchemy | SQLite | JWT / OAuth2 | Swagger / OpenAPI | Git / GitHub | Postman | Diseno RESTful | Modelado de datos relacional</w:t>
+            </w:r>
+          </w:p>
+          <w:p>
+            <w:pPr>
+              <w:spacing w:before="80" w:after="80"/>
+            </w:pPr>
+          </w:p>
+          <w:p>
             <w:r>
               <w:rPr>
                 <w:b/>
@@ -3795,675 +3023,12 @@
                 <w:sz w:val="24"/>
                 <w:szCs w:val="24"/>
               </w:rPr>
-              <w:t>tecnica</w:t>
-            </w:r>
-            <w:proofErr w:type="spellEnd"/>
-            <w:r>
-              <w:rPr>
-                <w:b/>
-                <w:bCs/>
-                <w:color w:val="4A90D9"/>
-                <w:sz w:val="24"/>
-                <w:szCs w:val="24"/>
-              </w:rPr>
-              <w:t xml:space="preserve"> utilizada</w:t>
-            </w:r>
-          </w:p>
-          <w:p>
-            <w:proofErr w:type="spellStart"/>
-            <w:r>
-              <w:t>FastAPI</w:t>
-            </w:r>
-            <w:proofErr w:type="spellEnd"/>
-            <w:r>
-              <w:t xml:space="preserve"> (Python): </w:t>
-            </w:r>
-            <w:proofErr w:type="spellStart"/>
-            <w:r>
-              <w:t>framework</w:t>
-            </w:r>
-            <w:proofErr w:type="spellEnd"/>
-            <w:r>
-              <w:t xml:space="preserve"> moderno de alto rendimiento para construir </w:t>
-            </w:r>
-            <w:proofErr w:type="spellStart"/>
-            <w:r>
-              <w:t>APIs</w:t>
-            </w:r>
-            <w:proofErr w:type="spellEnd"/>
-            <w:r>
-              <w:t xml:space="preserve"> con </w:t>
-            </w:r>
-            <w:proofErr w:type="spellStart"/>
-            <w:r>
-              <w:t>validacion</w:t>
-            </w:r>
-            <w:proofErr w:type="spellEnd"/>
-            <w:r>
-              <w:t xml:space="preserve"> </w:t>
-            </w:r>
-            <w:proofErr w:type="spellStart"/>
-            <w:r>
-              <w:t>automatica</w:t>
-            </w:r>
-            <w:proofErr w:type="spellEnd"/>
-            <w:r>
-              <w:t xml:space="preserve"> </w:t>
-            </w:r>
-            <w:proofErr w:type="spellStart"/>
-            <w:r>
-              <w:t>via</w:t>
-            </w:r>
-            <w:proofErr w:type="spellEnd"/>
-            <w:r>
-              <w:t xml:space="preserve"> </w:t>
-            </w:r>
-            <w:proofErr w:type="spellStart"/>
-            <w:r>
-              <w:t>Pydantic</w:t>
-            </w:r>
-            <w:proofErr w:type="spellEnd"/>
-            <w:r>
-              <w:t xml:space="preserve">, </w:t>
-            </w:r>
-            <w:proofErr w:type="spellStart"/>
-            <w:r>
-              <w:t>documentacion</w:t>
-            </w:r>
-            <w:proofErr w:type="spellEnd"/>
-            <w:r>
-              <w:t xml:space="preserve"> </w:t>
-            </w:r>
-            <w:proofErr w:type="spellStart"/>
-            <w:r>
-              <w:t>Swagger</w:t>
-            </w:r>
-            <w:proofErr w:type="spellEnd"/>
-            <w:r>
-              <w:t>/</w:t>
-            </w:r>
-            <w:proofErr w:type="spellStart"/>
-            <w:r>
-              <w:t>OpenAPI</w:t>
-            </w:r>
-            <w:proofErr w:type="spellEnd"/>
-            <w:r>
-              <w:t xml:space="preserve"> integrada y soporte nativo para operaciones </w:t>
-            </w:r>
-            <w:proofErr w:type="spellStart"/>
-            <w:r>
-              <w:t>asincronas</w:t>
-            </w:r>
-            <w:proofErr w:type="spellEnd"/>
-            <w:r>
-              <w:t xml:space="preserve">. Se </w:t>
-            </w:r>
-            <w:proofErr w:type="spellStart"/>
-            <w:r>
-              <w:t>eligio</w:t>
-            </w:r>
-            <w:proofErr w:type="spellEnd"/>
-            <w:r>
-              <w:t xml:space="preserve"> sobre </w:t>
-            </w:r>
-            <w:proofErr w:type="spellStart"/>
-            <w:r>
-              <w:t>Flask</w:t>
-            </w:r>
-            <w:proofErr w:type="spellEnd"/>
-            <w:r>
-              <w:t xml:space="preserve"> por su velocidad de desarrollo, tipado </w:t>
-            </w:r>
-            <w:proofErr w:type="spellStart"/>
-            <w:r>
-              <w:t>estatico</w:t>
-            </w:r>
-            <w:proofErr w:type="spellEnd"/>
-            <w:r>
-              <w:t xml:space="preserve"> y </w:t>
-            </w:r>
-            <w:proofErr w:type="spellStart"/>
-            <w:r>
-              <w:t>generacion</w:t>
-            </w:r>
-            <w:proofErr w:type="spellEnd"/>
-            <w:r>
-              <w:t xml:space="preserve"> </w:t>
-            </w:r>
-            <w:proofErr w:type="spellStart"/>
-            <w:r>
-              <w:t>automatica</w:t>
-            </w:r>
-            <w:proofErr w:type="spellEnd"/>
-            <w:r>
-              <w:t xml:space="preserve"> de docs.</w:t>
-            </w:r>
-          </w:p>
-          <w:p>
-            <w:pPr>
-              <w:spacing w:before="80" w:after="80"/>
-            </w:pPr>
-          </w:p>
-          <w:p>
-            <w:r>
-              <w:rPr>
-                <w:b/>
-                <w:bCs/>
-                <w:color w:val="4A90D9"/>
-                <w:sz w:val="24"/>
-                <w:szCs w:val="24"/>
-              </w:rPr>
-              <w:t>Principales aprendizajes</w:t>
-            </w:r>
-          </w:p>
-          <w:p>
-            <w:r>
-              <w:t xml:space="preserve">- </w:t>
-            </w:r>
-            <w:proofErr w:type="spellStart"/>
-            <w:r>
-              <w:t>Comprension</w:t>
-            </w:r>
-            <w:proofErr w:type="spellEnd"/>
-            <w:r>
-              <w:t xml:space="preserve"> profunda del ciclo de vida de una solicitud HTTP y el </w:t>
-            </w:r>
-            <w:proofErr w:type="spellStart"/>
-            <w:r>
-              <w:t>diseno</w:t>
-            </w:r>
-            <w:proofErr w:type="spellEnd"/>
-            <w:r>
-              <w:t xml:space="preserve"> de </w:t>
-            </w:r>
-            <w:proofErr w:type="spellStart"/>
-            <w:r>
-              <w:t>endpoints</w:t>
-            </w:r>
-            <w:proofErr w:type="spellEnd"/>
-            <w:r>
-              <w:t xml:space="preserve"> REST.</w:t>
-            </w:r>
-          </w:p>
-          <w:p>
-            <w:r>
-              <w:t xml:space="preserve">- Uso de </w:t>
-            </w:r>
-            <w:proofErr w:type="spellStart"/>
-            <w:r>
-              <w:t>ORMs</w:t>
-            </w:r>
-            <w:proofErr w:type="spellEnd"/>
-            <w:r>
-              <w:t xml:space="preserve"> para abstraer la capa de datos y mejorar la mantenibilidad.</w:t>
-            </w:r>
-          </w:p>
-          <w:p>
-            <w:r>
-              <w:t xml:space="preserve">- </w:t>
-            </w:r>
-            <w:proofErr w:type="spellStart"/>
-            <w:r>
-              <w:t>Implementacion</w:t>
-            </w:r>
-            <w:proofErr w:type="spellEnd"/>
-            <w:r>
-              <w:t xml:space="preserve"> de </w:t>
-            </w:r>
-            <w:proofErr w:type="spellStart"/>
-            <w:r>
-              <w:t>autenticacion</w:t>
-            </w:r>
-            <w:proofErr w:type="spellEnd"/>
-            <w:r>
-              <w:t xml:space="preserve"> segura con tokens JWT.</w:t>
-            </w:r>
-          </w:p>
-          <w:p>
-            <w:r>
-              <w:t xml:space="preserve">- Valor de la </w:t>
-            </w:r>
-            <w:proofErr w:type="spellStart"/>
-            <w:r>
-              <w:t>documentacion</w:t>
-            </w:r>
-            <w:proofErr w:type="spellEnd"/>
-            <w:r>
-              <w:t xml:space="preserve"> </w:t>
-            </w:r>
-            <w:proofErr w:type="spellStart"/>
-            <w:r>
-              <w:t>tecnica</w:t>
-            </w:r>
-            <w:proofErr w:type="spellEnd"/>
-            <w:r>
-              <w:t xml:space="preserve"> </w:t>
-            </w:r>
-            <w:proofErr w:type="spellStart"/>
-            <w:r>
-              <w:t>automatica</w:t>
-            </w:r>
-            <w:proofErr w:type="spellEnd"/>
-            <w:r>
-              <w:t xml:space="preserve"> para facilitar la </w:t>
-            </w:r>
-            <w:proofErr w:type="spellStart"/>
-            <w:r>
-              <w:t>colaboracion</w:t>
-            </w:r>
-            <w:proofErr w:type="spellEnd"/>
-            <w:r>
-              <w:t xml:space="preserve"> entre equipos.</w:t>
-            </w:r>
-          </w:p>
-          <w:p>
-            <w:r>
-              <w:t xml:space="preserve">- </w:t>
-            </w:r>
-            <w:proofErr w:type="spellStart"/>
-            <w:r>
-              <w:t>Integracion</w:t>
-            </w:r>
-            <w:proofErr w:type="spellEnd"/>
-            <w:r>
-              <w:t xml:space="preserve"> entre conocimiento de dominio (procesos industriales) y soluciones de software.</w:t>
-            </w:r>
-          </w:p>
-          <w:p>
-            <w:pPr>
-              <w:spacing w:before="80" w:after="80"/>
-            </w:pPr>
-          </w:p>
-          <w:p>
-            <w:proofErr w:type="spellStart"/>
-            <w:r>
-              <w:rPr>
-                <w:b/>
-                <w:bCs/>
-                <w:color w:val="4A90D9"/>
-                <w:sz w:val="24"/>
-                <w:szCs w:val="24"/>
-              </w:rPr>
-              <w:t>Metricas</w:t>
-            </w:r>
-            <w:proofErr w:type="spellEnd"/>
-            <w:r>
-              <w:rPr>
-                <w:b/>
-                <w:bCs/>
-                <w:color w:val="4A90D9"/>
-                <w:sz w:val="24"/>
-                <w:szCs w:val="24"/>
-              </w:rPr>
-              <w:t xml:space="preserve"> de impacto logradas</w:t>
-            </w:r>
-          </w:p>
-          <w:p>
-            <w:r>
-              <w:t xml:space="preserve">- Tiempo de respuesta promedio del </w:t>
-            </w:r>
-            <w:proofErr w:type="spellStart"/>
-            <w:r>
-              <w:t>endpoint</w:t>
-            </w:r>
-            <w:proofErr w:type="spellEnd"/>
-            <w:r>
-              <w:t>: &lt; 80 ms bajo carga simulada.</w:t>
-            </w:r>
-          </w:p>
-          <w:p>
-            <w:r>
-              <w:t xml:space="preserve">- Cobertura de </w:t>
-            </w:r>
-            <w:proofErr w:type="spellStart"/>
-            <w:r>
-              <w:t>endpoints</w:t>
-            </w:r>
-            <w:proofErr w:type="spellEnd"/>
-            <w:r>
-              <w:t xml:space="preserve"> documentados: 100% </w:t>
-            </w:r>
-            <w:proofErr w:type="spellStart"/>
-            <w:r>
-              <w:t>via</w:t>
-            </w:r>
-            <w:proofErr w:type="spellEnd"/>
-            <w:r>
-              <w:t xml:space="preserve"> </w:t>
-            </w:r>
-            <w:proofErr w:type="spellStart"/>
-            <w:r>
-              <w:t>Swagger</w:t>
-            </w:r>
-            <w:proofErr w:type="spellEnd"/>
-            <w:r>
-              <w:t xml:space="preserve"> UI.</w:t>
-            </w:r>
-          </w:p>
-          <w:p>
-            <w:r>
-              <w:t xml:space="preserve">- </w:t>
-            </w:r>
-            <w:proofErr w:type="spellStart"/>
-            <w:r>
-              <w:t>Reduccion</w:t>
-            </w:r>
-            <w:proofErr w:type="spellEnd"/>
-            <w:r>
-              <w:t xml:space="preserve"> del tiempo de onboarding para consumir la API: de 2 horas a 20 minutos gracias a la </w:t>
-            </w:r>
-            <w:proofErr w:type="spellStart"/>
-            <w:r>
-              <w:t>documentacion</w:t>
-            </w:r>
-            <w:proofErr w:type="spellEnd"/>
-            <w:r>
-              <w:t xml:space="preserve"> </w:t>
-            </w:r>
-            <w:proofErr w:type="spellStart"/>
-            <w:r>
-              <w:t>automatica</w:t>
-            </w:r>
-            <w:proofErr w:type="spellEnd"/>
-            <w:r>
-              <w:t>.</w:t>
-            </w:r>
-          </w:p>
-          <w:p>
-            <w:r>
-              <w:t xml:space="preserve">- 0 vulnerabilidades de </w:t>
-            </w:r>
-            <w:proofErr w:type="spellStart"/>
-            <w:r>
-              <w:t>autenticacion</w:t>
-            </w:r>
-            <w:proofErr w:type="spellEnd"/>
-            <w:r>
-              <w:t xml:space="preserve"> detectadas en </w:t>
-            </w:r>
-            <w:proofErr w:type="spellStart"/>
-            <w:r>
-              <w:t>revision</w:t>
-            </w:r>
-            <w:proofErr w:type="spellEnd"/>
-            <w:r>
-              <w:t xml:space="preserve"> de pares.</w:t>
-            </w:r>
-          </w:p>
-          <w:p>
-            <w:pPr>
-              <w:spacing w:before="80" w:after="80"/>
-            </w:pPr>
-          </w:p>
-          <w:p>
-            <w:r>
-              <w:rPr>
-                <w:b/>
-                <w:bCs/>
-                <w:color w:val="4A90D9"/>
-                <w:sz w:val="24"/>
-                <w:szCs w:val="24"/>
-              </w:rPr>
-              <w:t xml:space="preserve">Habilidades </w:t>
-            </w:r>
-            <w:proofErr w:type="spellStart"/>
-            <w:r>
-              <w:rPr>
-                <w:b/>
-                <w:bCs/>
-                <w:color w:val="4A90D9"/>
-                <w:sz w:val="24"/>
-                <w:szCs w:val="24"/>
-              </w:rPr>
-              <w:t>tecnicas</w:t>
-            </w:r>
-            <w:proofErr w:type="spellEnd"/>
-            <w:r>
-              <w:rPr>
-                <w:b/>
-                <w:bCs/>
-                <w:color w:val="4A90D9"/>
-                <w:sz w:val="24"/>
-                <w:szCs w:val="24"/>
-              </w:rPr>
-              <w:t xml:space="preserve"> aplicadas</w:t>
-            </w:r>
-          </w:p>
-          <w:p>
-            <w:r>
-              <w:rPr>
-                <w:color w:val="333333"/>
-              </w:rPr>
-              <w:lastRenderedPageBreak/>
-              <w:t xml:space="preserve">Python | </w:t>
-            </w:r>
-            <w:proofErr w:type="spellStart"/>
-            <w:r>
-              <w:rPr>
-                <w:color w:val="333333"/>
-              </w:rPr>
-              <w:t>FastAPI</w:t>
-            </w:r>
-            <w:proofErr w:type="spellEnd"/>
-            <w:r>
-              <w:rPr>
-                <w:color w:val="333333"/>
-              </w:rPr>
-              <w:t xml:space="preserve"> | </w:t>
-            </w:r>
-            <w:proofErr w:type="spellStart"/>
-            <w:r>
-              <w:rPr>
-                <w:color w:val="333333"/>
-              </w:rPr>
-              <w:t>SQLAlchemy</w:t>
-            </w:r>
-            <w:proofErr w:type="spellEnd"/>
-            <w:r>
-              <w:rPr>
-                <w:color w:val="333333"/>
-              </w:rPr>
-              <w:t xml:space="preserve"> | SQLite | JWT / OAuth2 | </w:t>
-            </w:r>
-            <w:proofErr w:type="spellStart"/>
-            <w:r>
-              <w:rPr>
-                <w:color w:val="333333"/>
-              </w:rPr>
-              <w:t>Swagger</w:t>
-            </w:r>
-            <w:proofErr w:type="spellEnd"/>
-            <w:r>
-              <w:rPr>
-                <w:color w:val="333333"/>
-              </w:rPr>
-              <w:t xml:space="preserve"> / </w:t>
-            </w:r>
-            <w:proofErr w:type="spellStart"/>
-            <w:r>
-              <w:rPr>
-                <w:color w:val="333333"/>
-              </w:rPr>
-              <w:t>OpenAPI</w:t>
-            </w:r>
-            <w:proofErr w:type="spellEnd"/>
-            <w:r>
-              <w:rPr>
-                <w:color w:val="333333"/>
-              </w:rPr>
-              <w:t xml:space="preserve"> | Git / GitHub | </w:t>
-            </w:r>
-            <w:proofErr w:type="spellStart"/>
-            <w:r>
-              <w:rPr>
-                <w:color w:val="333333"/>
-              </w:rPr>
-              <w:t>Postman</w:t>
-            </w:r>
-            <w:proofErr w:type="spellEnd"/>
-            <w:r>
-              <w:rPr>
-                <w:color w:val="333333"/>
-              </w:rPr>
-              <w:t xml:space="preserve"> | </w:t>
-            </w:r>
-            <w:proofErr w:type="spellStart"/>
-            <w:r>
-              <w:rPr>
-                <w:color w:val="333333"/>
-              </w:rPr>
-              <w:t>Diseno</w:t>
-            </w:r>
-            <w:proofErr w:type="spellEnd"/>
-            <w:r>
-              <w:rPr>
-                <w:color w:val="333333"/>
-              </w:rPr>
-              <w:t xml:space="preserve"> </w:t>
-            </w:r>
-            <w:proofErr w:type="spellStart"/>
-            <w:r>
-              <w:rPr>
-                <w:color w:val="333333"/>
-              </w:rPr>
-              <w:t>RESTful</w:t>
-            </w:r>
-            <w:proofErr w:type="spellEnd"/>
-            <w:r>
-              <w:rPr>
-                <w:color w:val="333333"/>
-              </w:rPr>
-              <w:t xml:space="preserve"> | Modelado de datos relacional</w:t>
-            </w:r>
-          </w:p>
-          <w:p>
-            <w:pPr>
-              <w:spacing w:before="80" w:after="80"/>
-            </w:pPr>
-          </w:p>
-          <w:p>
-            <w:proofErr w:type="spellStart"/>
-            <w:r>
-              <w:rPr>
-                <w:b/>
-                <w:bCs/>
-                <w:color w:val="4A90D9"/>
-                <w:sz w:val="24"/>
-                <w:szCs w:val="24"/>
-              </w:rPr>
-              <w:t>Por que</w:t>
-            </w:r>
-            <w:proofErr w:type="spellEnd"/>
-            <w:r>
-              <w:rPr>
-                <w:b/>
-                <w:bCs/>
-                <w:color w:val="4A90D9"/>
-                <w:sz w:val="24"/>
-                <w:szCs w:val="24"/>
-              </w:rPr>
-              <w:t xml:space="preserve"> este proyecto para el portafolio</w:t>
-            </w:r>
-          </w:p>
-          <w:p>
-            <w:r>
-              <w:t xml:space="preserve">Seleccione este proyecto porque representa la </w:t>
-            </w:r>
-            <w:proofErr w:type="spellStart"/>
-            <w:r>
-              <w:t>interseccion</w:t>
-            </w:r>
-            <w:proofErr w:type="spellEnd"/>
-            <w:r>
-              <w:t xml:space="preserve"> entre mi </w:t>
-            </w:r>
-            <w:proofErr w:type="spellStart"/>
-            <w:r>
-              <w:t>formacion</w:t>
-            </w:r>
-            <w:proofErr w:type="spellEnd"/>
-            <w:r>
-              <w:t xml:space="preserve"> de base como Ingeniero </w:t>
-            </w:r>
-            <w:proofErr w:type="spellStart"/>
-            <w:r>
-              <w:t>Quimico</w:t>
-            </w:r>
-            <w:proofErr w:type="spellEnd"/>
-            <w:r>
-              <w:t xml:space="preserve"> y las habilidades adquiridas en el </w:t>
-            </w:r>
-            <w:proofErr w:type="spellStart"/>
-            <w:r>
-              <w:t>bootcamp</w:t>
-            </w:r>
-            <w:proofErr w:type="spellEnd"/>
-            <w:r>
-              <w:t xml:space="preserve"> full stack. Es el proyecto que mejor evidencia mi capacidad para trasladar un problema real de dominio industrial a una </w:t>
-            </w:r>
-            <w:proofErr w:type="spellStart"/>
-            <w:r>
-              <w:t>solucion</w:t>
-            </w:r>
-            <w:proofErr w:type="spellEnd"/>
-            <w:r>
-              <w:t xml:space="preserve"> </w:t>
-            </w:r>
-            <w:proofErr w:type="spellStart"/>
-            <w:r>
-              <w:t>tecnologica</w:t>
-            </w:r>
-            <w:proofErr w:type="spellEnd"/>
-            <w:r>
-              <w:t xml:space="preserve"> funcional, documentada y colaborativa. </w:t>
-            </w:r>
-            <w:proofErr w:type="spellStart"/>
-            <w:r>
-              <w:t>Ademas</w:t>
-            </w:r>
-            <w:proofErr w:type="spellEnd"/>
-            <w:r>
-              <w:t xml:space="preserve">, demuestra pensamiento </w:t>
-            </w:r>
-            <w:proofErr w:type="spellStart"/>
-            <w:r>
-              <w:t>sistemico</w:t>
-            </w:r>
-            <w:proofErr w:type="spellEnd"/>
-            <w:r>
-              <w:t xml:space="preserve">, </w:t>
-            </w:r>
-            <w:proofErr w:type="spellStart"/>
-            <w:r>
-              <w:t>orientacion</w:t>
-            </w:r>
-            <w:proofErr w:type="spellEnd"/>
-            <w:r>
-              <w:t xml:space="preserve"> al usuario </w:t>
-            </w:r>
-            <w:proofErr w:type="spellStart"/>
-            <w:r>
-              <w:t>tecnico</w:t>
-            </w:r>
-            <w:proofErr w:type="spellEnd"/>
-            <w:r>
-              <w:t xml:space="preserve"> y </w:t>
-            </w:r>
-            <w:proofErr w:type="spellStart"/>
-            <w:r>
-              <w:t>comprension</w:t>
-            </w:r>
-            <w:proofErr w:type="spellEnd"/>
-            <w:r>
-              <w:t xml:space="preserve"> del ciclo de vida de una API en </w:t>
-            </w:r>
-            <w:proofErr w:type="spellStart"/>
-            <w:r>
-              <w:t>produccion</w:t>
-            </w:r>
-            <w:proofErr w:type="spellEnd"/>
-            <w:r>
-              <w:t>.</w:t>
+              <w:t>Por que este proyecto para el portafolio</w:t>
+            </w:r>
+          </w:p>
+          <w:p>
+            <w:r>
+              <w:t>Seleccione este proyecto porque representa la interseccion entre mi formacion de base como Ingeniero Quimico y las habilidades adquiridas en el bootcamp full stack. Es el proyecto que mejor evidencia mi capacidad para trasladar un problema real de dominio industrial a una solucion tecnologica funcional, documentada y colaborativa. Ademas, demuestra pensamiento sistemico, orientacion al usuario tecnico y comprension del ciclo de vida de una API en produccion.</w:t>
             </w:r>
           </w:p>
         </w:tc>
@@ -4488,15 +3053,7 @@
       </w:pPr>
       <w:r>
         <w:lastRenderedPageBreak/>
-        <w:t xml:space="preserve">PLUS: </w:t>
-      </w:r>
-      <w:proofErr w:type="spellStart"/>
-      <w:r>
-        <w:t>Analisis</w:t>
-      </w:r>
-      <w:proofErr w:type="spellEnd"/>
-      <w:r>
-        <w:t xml:space="preserve"> Personal — Matriz FODA</w:t>
+        <w:t>PLUS: Analisis Personal — Matriz FODA</w:t>
       </w:r>
     </w:p>
     <w:p>
@@ -4505,79 +3062,7 @@
         <w:jc w:val="both"/>
       </w:pPr>
       <w:r>
-        <w:t xml:space="preserve">A </w:t>
-      </w:r>
-      <w:proofErr w:type="spellStart"/>
-      <w:r>
-        <w:t>continuacion</w:t>
-      </w:r>
-      <w:proofErr w:type="spellEnd"/>
-      <w:r>
-        <w:t xml:space="preserve"> se presenta el </w:t>
-      </w:r>
-      <w:proofErr w:type="spellStart"/>
-      <w:r>
-        <w:t>analisis</w:t>
-      </w:r>
-      <w:proofErr w:type="spellEnd"/>
-      <w:r>
-        <w:t xml:space="preserve"> FODA personal, considerando tanto el perfil </w:t>
-      </w:r>
-      <w:proofErr w:type="spellStart"/>
-      <w:r>
-        <w:t>tecnico</w:t>
-      </w:r>
-      <w:proofErr w:type="spellEnd"/>
-      <w:r>
-        <w:t xml:space="preserve"> de Ingeniero </w:t>
-      </w:r>
-      <w:proofErr w:type="spellStart"/>
-      <w:r>
-        <w:t>Quimico</w:t>
-      </w:r>
-      <w:proofErr w:type="spellEnd"/>
-      <w:r>
-        <w:t xml:space="preserve"> como la </w:t>
-      </w:r>
-      <w:proofErr w:type="spellStart"/>
-      <w:r>
-        <w:t>formacion</w:t>
-      </w:r>
-      <w:proofErr w:type="spellEnd"/>
-      <w:r>
-        <w:t xml:space="preserve"> en desarrollo full stack. Este </w:t>
-      </w:r>
-      <w:proofErr w:type="spellStart"/>
-      <w:r>
-        <w:t>analisis</w:t>
-      </w:r>
-      <w:proofErr w:type="spellEnd"/>
-      <w:r>
-        <w:t xml:space="preserve"> permite identificar de forma </w:t>
-      </w:r>
-      <w:proofErr w:type="spellStart"/>
-      <w:r>
-        <w:t>estrategica</w:t>
-      </w:r>
-      <w:proofErr w:type="spellEnd"/>
-      <w:r>
-        <w:t xml:space="preserve"> el posicionamiento actual y las </w:t>
-      </w:r>
-      <w:proofErr w:type="spellStart"/>
-      <w:r>
-        <w:t>areas</w:t>
-      </w:r>
-      <w:proofErr w:type="spellEnd"/>
-      <w:r>
-        <w:t xml:space="preserve"> de enfoque para la </w:t>
-      </w:r>
-      <w:proofErr w:type="spellStart"/>
-      <w:r>
-        <w:t>insercion</w:t>
-      </w:r>
-      <w:proofErr w:type="spellEnd"/>
-      <w:r>
-        <w:t xml:space="preserve"> laboral en el sector IT.</w:t>
+        <w:t>A continuacion se presenta el analisis FODA personal, considerando tanto el perfil tecnico de Ingeniero Quimico como la formacion en desarrollo full stack. Este analisis permite identificar de forma estrategica el posicionamiento actual y las areas de enfoque para la insercion laboral en el sector IT.</w:t>
       </w:r>
     </w:p>
     <w:p>
@@ -4767,228 +3252,52 @@
                 <w:sz w:val="21"/>
                 <w:szCs w:val="21"/>
               </w:rPr>
-              <w:t xml:space="preserve">F1. Perfil hibrido </w:t>
-            </w:r>
-            <w:proofErr w:type="spellStart"/>
+              <w:t>F1. Perfil hibrido unico: formacion en ingenieria + programacion.</w:t>
+            </w:r>
+          </w:p>
+          <w:p>
+            <w:pPr>
+              <w:spacing w:after="60"/>
+            </w:pPr>
             <w:r>
               <w:rPr>
                 <w:sz w:val="21"/>
                 <w:szCs w:val="21"/>
               </w:rPr>
-              <w:t>unico</w:t>
-            </w:r>
-            <w:proofErr w:type="spellEnd"/>
+              <w:t>F2. Pensamiento analitico y resolucion de problemas complejos.</w:t>
+            </w:r>
+          </w:p>
+          <w:p>
+            <w:pPr>
+              <w:spacing w:after="60"/>
+            </w:pPr>
             <w:r>
               <w:rPr>
                 <w:sz w:val="21"/>
                 <w:szCs w:val="21"/>
               </w:rPr>
-              <w:t xml:space="preserve">: </w:t>
-            </w:r>
-            <w:proofErr w:type="spellStart"/>
+              <w:t>F3. Solida base matematica y estadistica aplicable a ciencia de datos.</w:t>
+            </w:r>
+          </w:p>
+          <w:p>
+            <w:pPr>
+              <w:spacing w:after="60"/>
+            </w:pPr>
             <w:r>
               <w:rPr>
                 <w:sz w:val="21"/>
                 <w:szCs w:val="21"/>
               </w:rPr>
-              <w:t>formacion</w:t>
-            </w:r>
-            <w:proofErr w:type="spellEnd"/>
+              <w:t>F4. Capacidad de documentar procesos tecnicos de forma clara y estructurada.</w:t>
+            </w:r>
+          </w:p>
+          <w:p>
             <w:r>
               <w:rPr>
                 <w:sz w:val="21"/>
                 <w:szCs w:val="21"/>
               </w:rPr>
-              <w:t xml:space="preserve"> en </w:t>
-            </w:r>
-            <w:proofErr w:type="spellStart"/>
-            <w:r>
-              <w:rPr>
-                <w:sz w:val="21"/>
-                <w:szCs w:val="21"/>
-              </w:rPr>
-              <w:t>ingenieria</w:t>
-            </w:r>
-            <w:proofErr w:type="spellEnd"/>
-            <w:r>
-              <w:rPr>
-                <w:sz w:val="21"/>
-                <w:szCs w:val="21"/>
-              </w:rPr>
-              <w:t xml:space="preserve"> + </w:t>
-            </w:r>
-            <w:proofErr w:type="spellStart"/>
-            <w:r>
-              <w:rPr>
-                <w:sz w:val="21"/>
-                <w:szCs w:val="21"/>
-              </w:rPr>
-              <w:t>programacion</w:t>
-            </w:r>
-            <w:proofErr w:type="spellEnd"/>
-            <w:r>
-              <w:rPr>
-                <w:sz w:val="21"/>
-                <w:szCs w:val="21"/>
-              </w:rPr>
-              <w:t>.</w:t>
-            </w:r>
-          </w:p>
-          <w:p>
-            <w:pPr>
-              <w:spacing w:after="60"/>
-            </w:pPr>
-            <w:r>
-              <w:rPr>
-                <w:sz w:val="21"/>
-                <w:szCs w:val="21"/>
-              </w:rPr>
-              <w:t xml:space="preserve">F2. Pensamiento </w:t>
-            </w:r>
-            <w:proofErr w:type="spellStart"/>
-            <w:r>
-              <w:rPr>
-                <w:sz w:val="21"/>
-                <w:szCs w:val="21"/>
-              </w:rPr>
-              <w:t>analitico</w:t>
-            </w:r>
-            <w:proofErr w:type="spellEnd"/>
-            <w:r>
-              <w:rPr>
-                <w:sz w:val="21"/>
-                <w:szCs w:val="21"/>
-              </w:rPr>
-              <w:t xml:space="preserve"> y </w:t>
-            </w:r>
-            <w:proofErr w:type="spellStart"/>
-            <w:r>
-              <w:rPr>
-                <w:sz w:val="21"/>
-                <w:szCs w:val="21"/>
-              </w:rPr>
-              <w:t>resolucion</w:t>
-            </w:r>
-            <w:proofErr w:type="spellEnd"/>
-            <w:r>
-              <w:rPr>
-                <w:sz w:val="21"/>
-                <w:szCs w:val="21"/>
-              </w:rPr>
-              <w:t xml:space="preserve"> de problemas complejos.</w:t>
-            </w:r>
-          </w:p>
-          <w:p>
-            <w:pPr>
-              <w:spacing w:after="60"/>
-            </w:pPr>
-            <w:r>
-              <w:rPr>
-                <w:sz w:val="21"/>
-                <w:szCs w:val="21"/>
-              </w:rPr>
-              <w:t xml:space="preserve">F3. </w:t>
-            </w:r>
-            <w:proofErr w:type="spellStart"/>
-            <w:r>
-              <w:rPr>
-                <w:sz w:val="21"/>
-                <w:szCs w:val="21"/>
-              </w:rPr>
-              <w:t>Solida</w:t>
-            </w:r>
-            <w:proofErr w:type="spellEnd"/>
-            <w:r>
-              <w:rPr>
-                <w:sz w:val="21"/>
-                <w:szCs w:val="21"/>
-              </w:rPr>
-              <w:t xml:space="preserve"> base </w:t>
-            </w:r>
-            <w:proofErr w:type="spellStart"/>
-            <w:r>
-              <w:rPr>
-                <w:sz w:val="21"/>
-                <w:szCs w:val="21"/>
-              </w:rPr>
-              <w:t>matematica</w:t>
-            </w:r>
-            <w:proofErr w:type="spellEnd"/>
-            <w:r>
-              <w:rPr>
-                <w:sz w:val="21"/>
-                <w:szCs w:val="21"/>
-              </w:rPr>
-              <w:t xml:space="preserve"> y </w:t>
-            </w:r>
-            <w:proofErr w:type="spellStart"/>
-            <w:r>
-              <w:rPr>
-                <w:sz w:val="21"/>
-                <w:szCs w:val="21"/>
-              </w:rPr>
-              <w:t>estadistica</w:t>
-            </w:r>
-            <w:proofErr w:type="spellEnd"/>
-            <w:r>
-              <w:rPr>
-                <w:sz w:val="21"/>
-                <w:szCs w:val="21"/>
-              </w:rPr>
-              <w:t xml:space="preserve"> aplicable a ciencia de datos.</w:t>
-            </w:r>
-          </w:p>
-          <w:p>
-            <w:pPr>
-              <w:spacing w:after="60"/>
-            </w:pPr>
-            <w:r>
-              <w:rPr>
-                <w:sz w:val="21"/>
-                <w:szCs w:val="21"/>
-              </w:rPr>
-              <w:t xml:space="preserve">F4. Capacidad de documentar procesos </w:t>
-            </w:r>
-            <w:proofErr w:type="spellStart"/>
-            <w:r>
-              <w:rPr>
-                <w:sz w:val="21"/>
-                <w:szCs w:val="21"/>
-              </w:rPr>
-              <w:t>tecnicos</w:t>
-            </w:r>
-            <w:proofErr w:type="spellEnd"/>
-            <w:r>
-              <w:rPr>
-                <w:sz w:val="21"/>
-                <w:szCs w:val="21"/>
-              </w:rPr>
-              <w:t xml:space="preserve"> de forma clara y estructurada.</w:t>
-            </w:r>
-          </w:p>
-          <w:p>
-            <w:r>
-              <w:rPr>
-                <w:sz w:val="21"/>
-                <w:szCs w:val="21"/>
-              </w:rPr>
-              <w:t xml:space="preserve">F5. Alta </w:t>
-            </w:r>
-            <w:proofErr w:type="spellStart"/>
-            <w:r>
-              <w:rPr>
-                <w:sz w:val="21"/>
-                <w:szCs w:val="21"/>
-              </w:rPr>
-              <w:t>motivacion</w:t>
-            </w:r>
-            <w:proofErr w:type="spellEnd"/>
-            <w:r>
-              <w:rPr>
-                <w:sz w:val="21"/>
-                <w:szCs w:val="21"/>
-              </w:rPr>
-              <w:t>, curiosidad intelectual y cultura de aprendizaje continuo.</w:t>
+              <w:t>F5. Alta motivacion, curiosidad intelectual y cultura de aprendizaje continuo.</w:t>
             </w:r>
           </w:p>
         </w:tc>
@@ -5018,212 +3327,52 @@
                 <w:sz w:val="21"/>
                 <w:szCs w:val="21"/>
               </w:rPr>
-              <w:t xml:space="preserve">O1. Alta demanda de perfiles full stack con dominio de industria en sectores como </w:t>
-            </w:r>
-            <w:proofErr w:type="spellStart"/>
+              <w:t>O1. Alta demanda de perfiles full stack con dominio de industria en sectores como Oil &amp; Gas, farmaceutica y manufactura 4.0.</w:t>
+            </w:r>
+          </w:p>
+          <w:p>
+            <w:pPr>
+              <w:spacing w:after="60"/>
+            </w:pPr>
             <w:r>
               <w:rPr>
                 <w:sz w:val="21"/>
                 <w:szCs w:val="21"/>
               </w:rPr>
-              <w:t>Oil</w:t>
-            </w:r>
-            <w:proofErr w:type="spellEnd"/>
+              <w:t>O2. Crecimiento sostenido del mercado de cloud computing y transformacion digital industrial.</w:t>
+            </w:r>
+          </w:p>
+          <w:p>
+            <w:pPr>
+              <w:spacing w:after="60"/>
+            </w:pPr>
             <w:r>
               <w:rPr>
                 <w:sz w:val="21"/>
                 <w:szCs w:val="21"/>
               </w:rPr>
-              <w:t xml:space="preserve"> &amp; Gas, </w:t>
-            </w:r>
-            <w:proofErr w:type="spellStart"/>
+              <w:t>O3. Expansion de roles remotos e internacionales en empresas tecnologicas globales.</w:t>
+            </w:r>
+          </w:p>
+          <w:p>
+            <w:pPr>
+              <w:spacing w:after="60"/>
+            </w:pPr>
             <w:r>
               <w:rPr>
                 <w:sz w:val="21"/>
                 <w:szCs w:val="21"/>
               </w:rPr>
-              <w:t>farmaceutica</w:t>
-            </w:r>
-            <w:proofErr w:type="spellEnd"/>
+              <w:t>O4. Auge de la inteligencia artificial aplicada a procesos industriales (IIoT, mantenimiento predictivo).</w:t>
+            </w:r>
+          </w:p>
+          <w:p>
             <w:r>
               <w:rPr>
                 <w:sz w:val="21"/>
                 <w:szCs w:val="21"/>
               </w:rPr>
-              <w:t xml:space="preserve"> y manufactura 4.0.</w:t>
-            </w:r>
-          </w:p>
-          <w:p>
-            <w:pPr>
-              <w:spacing w:after="60"/>
-            </w:pPr>
-            <w:r>
-              <w:rPr>
-                <w:sz w:val="21"/>
-                <w:szCs w:val="21"/>
-              </w:rPr>
-              <w:t xml:space="preserve">O2. Crecimiento sostenido del mercado de cloud </w:t>
-            </w:r>
-            <w:proofErr w:type="spellStart"/>
-            <w:r>
-              <w:rPr>
-                <w:sz w:val="21"/>
-                <w:szCs w:val="21"/>
-              </w:rPr>
-              <w:t>computing</w:t>
-            </w:r>
-            <w:proofErr w:type="spellEnd"/>
-            <w:r>
-              <w:rPr>
-                <w:sz w:val="21"/>
-                <w:szCs w:val="21"/>
-              </w:rPr>
-              <w:t xml:space="preserve"> y </w:t>
-            </w:r>
-            <w:proofErr w:type="spellStart"/>
-            <w:r>
-              <w:rPr>
-                <w:sz w:val="21"/>
-                <w:szCs w:val="21"/>
-              </w:rPr>
-              <w:t>transformacion</w:t>
-            </w:r>
-            <w:proofErr w:type="spellEnd"/>
-            <w:r>
-              <w:rPr>
-                <w:sz w:val="21"/>
-                <w:szCs w:val="21"/>
-              </w:rPr>
-              <w:t xml:space="preserve"> digital industrial.</w:t>
-            </w:r>
-          </w:p>
-          <w:p>
-            <w:pPr>
-              <w:spacing w:after="60"/>
-            </w:pPr>
-            <w:r>
-              <w:rPr>
-                <w:sz w:val="21"/>
-                <w:szCs w:val="21"/>
-              </w:rPr>
-              <w:t xml:space="preserve">O3. </w:t>
-            </w:r>
-            <w:proofErr w:type="spellStart"/>
-            <w:r>
-              <w:rPr>
-                <w:sz w:val="21"/>
-                <w:szCs w:val="21"/>
-              </w:rPr>
-              <w:t>Expansion</w:t>
-            </w:r>
-            <w:proofErr w:type="spellEnd"/>
-            <w:r>
-              <w:rPr>
-                <w:sz w:val="21"/>
-                <w:szCs w:val="21"/>
-              </w:rPr>
-              <w:t xml:space="preserve"> de roles remotos e internacionales en empresas </w:t>
-            </w:r>
-            <w:proofErr w:type="spellStart"/>
-            <w:r>
-              <w:rPr>
-                <w:sz w:val="21"/>
-                <w:szCs w:val="21"/>
-              </w:rPr>
-              <w:t>tecnologicas</w:t>
-            </w:r>
-            <w:proofErr w:type="spellEnd"/>
-            <w:r>
-              <w:rPr>
-                <w:sz w:val="21"/>
-                <w:szCs w:val="21"/>
-              </w:rPr>
-              <w:t xml:space="preserve"> globales.</w:t>
-            </w:r>
-          </w:p>
-          <w:p>
-            <w:pPr>
-              <w:spacing w:after="60"/>
-            </w:pPr>
-            <w:r>
-              <w:rPr>
-                <w:sz w:val="21"/>
-                <w:szCs w:val="21"/>
-              </w:rPr>
-              <w:t>O4. Auge de la inteligencia artificial aplicada a procesos industriales (</w:t>
-            </w:r>
-            <w:proofErr w:type="spellStart"/>
-            <w:r>
-              <w:rPr>
-                <w:sz w:val="21"/>
-                <w:szCs w:val="21"/>
-              </w:rPr>
-              <w:t>IIoT</w:t>
-            </w:r>
-            <w:proofErr w:type="spellEnd"/>
-            <w:r>
-              <w:rPr>
-                <w:sz w:val="21"/>
-                <w:szCs w:val="21"/>
-              </w:rPr>
-              <w:t>, mantenimiento predictivo).</w:t>
-            </w:r>
-          </w:p>
-          <w:p>
-            <w:r>
-              <w:rPr>
-                <w:sz w:val="21"/>
-                <w:szCs w:val="21"/>
-              </w:rPr>
-              <w:t xml:space="preserve">O5. Ecosistema de startups y </w:t>
-            </w:r>
-            <w:proofErr w:type="spellStart"/>
-            <w:r>
-              <w:rPr>
-                <w:sz w:val="21"/>
-                <w:szCs w:val="21"/>
-              </w:rPr>
-              <w:t>scale</w:t>
-            </w:r>
-            <w:proofErr w:type="spellEnd"/>
-            <w:r>
-              <w:rPr>
-                <w:sz w:val="21"/>
-                <w:szCs w:val="21"/>
-              </w:rPr>
-              <w:t xml:space="preserve">-ups en </w:t>
-            </w:r>
-            <w:proofErr w:type="spellStart"/>
-            <w:r>
-              <w:rPr>
-                <w:sz w:val="21"/>
-                <w:szCs w:val="21"/>
-              </w:rPr>
-              <w:t>Latinoamerica</w:t>
-            </w:r>
-            <w:proofErr w:type="spellEnd"/>
-            <w:r>
-              <w:rPr>
-                <w:sz w:val="21"/>
-                <w:szCs w:val="21"/>
-              </w:rPr>
-              <w:t xml:space="preserve"> que valoran perfiles </w:t>
-            </w:r>
-            <w:proofErr w:type="spellStart"/>
-            <w:r>
-              <w:rPr>
-                <w:sz w:val="21"/>
-                <w:szCs w:val="21"/>
-              </w:rPr>
-              <w:t>tecnicos</w:t>
-            </w:r>
-            <w:proofErr w:type="spellEnd"/>
-            <w:r>
-              <w:rPr>
-                <w:sz w:val="21"/>
-                <w:szCs w:val="21"/>
-              </w:rPr>
-              <w:t xml:space="preserve"> multidisciplinarios.</w:t>
+              <w:t>O5. Ecosistema de startups y scale-ups en Latinoamerica que valoran perfiles tecnicos multidisciplinarios.</w:t>
             </w:r>
           </w:p>
         </w:tc>
@@ -5333,175 +3482,31 @@
                 <w:sz w:val="21"/>
                 <w:szCs w:val="21"/>
               </w:rPr>
-              <w:t xml:space="preserve">D2. Nivel de </w:t>
-            </w:r>
-            <w:proofErr w:type="spellStart"/>
+              <w:t>D2. Nivel de ingles tecnico basico/intermedio: requiere mejora para entornos globales.</w:t>
+            </w:r>
+          </w:p>
+          <w:p>
+            <w:pPr>
+              <w:spacing w:after="60"/>
+            </w:pPr>
             <w:r>
               <w:rPr>
                 <w:sz w:val="21"/>
                 <w:szCs w:val="21"/>
               </w:rPr>
-              <w:t>ingles</w:t>
-            </w:r>
-            <w:proofErr w:type="spellEnd"/>
+              <w:t>D3. Red profesional (networking) aun en construccion dentro del ecosistema IT.</w:t>
+            </w:r>
+          </w:p>
+          <w:p>
+            <w:pPr>
+              <w:spacing w:after="60"/>
+            </w:pPr>
             <w:r>
               <w:rPr>
                 <w:sz w:val="21"/>
                 <w:szCs w:val="21"/>
               </w:rPr>
-              <w:t xml:space="preserve"> </w:t>
-            </w:r>
-            <w:proofErr w:type="spellStart"/>
-            <w:r>
-              <w:rPr>
-                <w:sz w:val="21"/>
-                <w:szCs w:val="21"/>
-              </w:rPr>
-              <w:t>tecnico</w:t>
-            </w:r>
-            <w:proofErr w:type="spellEnd"/>
-            <w:r>
-              <w:rPr>
-                <w:sz w:val="21"/>
-                <w:szCs w:val="21"/>
-              </w:rPr>
-              <w:t xml:space="preserve"> </w:t>
-            </w:r>
-            <w:proofErr w:type="spellStart"/>
-            <w:r>
-              <w:rPr>
-                <w:sz w:val="21"/>
-                <w:szCs w:val="21"/>
-              </w:rPr>
-              <w:t>basico</w:t>
-            </w:r>
-            <w:proofErr w:type="spellEnd"/>
-            <w:r>
-              <w:rPr>
-                <w:sz w:val="21"/>
-                <w:szCs w:val="21"/>
-              </w:rPr>
-              <w:t>/intermedio: requiere mejora para entornos globales.</w:t>
-            </w:r>
-          </w:p>
-          <w:p>
-            <w:pPr>
-              <w:spacing w:after="60"/>
-            </w:pPr>
-            <w:r>
-              <w:rPr>
-                <w:sz w:val="21"/>
-                <w:szCs w:val="21"/>
-              </w:rPr>
-              <w:t>D3. Red profesional (</w:t>
-            </w:r>
-            <w:proofErr w:type="spellStart"/>
-            <w:r>
-              <w:rPr>
-                <w:sz w:val="21"/>
-                <w:szCs w:val="21"/>
-              </w:rPr>
-              <w:t>networking</w:t>
-            </w:r>
-            <w:proofErr w:type="spellEnd"/>
-            <w:r>
-              <w:rPr>
-                <w:sz w:val="21"/>
-                <w:szCs w:val="21"/>
-              </w:rPr>
-              <w:t xml:space="preserve">) aun en </w:t>
-            </w:r>
-            <w:proofErr w:type="spellStart"/>
-            <w:r>
-              <w:rPr>
-                <w:sz w:val="21"/>
-                <w:szCs w:val="21"/>
-              </w:rPr>
-              <w:t>construccion</w:t>
-            </w:r>
-            <w:proofErr w:type="spellEnd"/>
-            <w:r>
-              <w:rPr>
-                <w:sz w:val="21"/>
-                <w:szCs w:val="21"/>
-              </w:rPr>
-              <w:t xml:space="preserve"> dentro del ecosistema IT.</w:t>
-            </w:r>
-          </w:p>
-          <w:p>
-            <w:pPr>
-              <w:spacing w:after="60"/>
-            </w:pPr>
-            <w:r>
-              <w:rPr>
-                <w:sz w:val="21"/>
-                <w:szCs w:val="21"/>
-              </w:rPr>
-              <w:t xml:space="preserve">D4. Curva de aprendizaje en herramientas de </w:t>
-            </w:r>
-            <w:proofErr w:type="spellStart"/>
-            <w:r>
-              <w:rPr>
-                <w:sz w:val="21"/>
-                <w:szCs w:val="21"/>
-              </w:rPr>
-              <w:t>gestion</w:t>
-            </w:r>
-            <w:proofErr w:type="spellEnd"/>
-            <w:r>
-              <w:rPr>
-                <w:sz w:val="21"/>
-                <w:szCs w:val="21"/>
-              </w:rPr>
-              <w:t xml:space="preserve"> </w:t>
-            </w:r>
-            <w:proofErr w:type="spellStart"/>
-            <w:r>
-              <w:rPr>
-                <w:sz w:val="21"/>
-                <w:szCs w:val="21"/>
-              </w:rPr>
-              <w:t>agil</w:t>
-            </w:r>
-            <w:proofErr w:type="spellEnd"/>
-            <w:r>
-              <w:rPr>
-                <w:sz w:val="21"/>
-                <w:szCs w:val="21"/>
-              </w:rPr>
-              <w:t xml:space="preserve"> (Jira, </w:t>
-            </w:r>
-            <w:proofErr w:type="spellStart"/>
-            <w:r>
-              <w:rPr>
-                <w:sz w:val="21"/>
-                <w:szCs w:val="21"/>
-              </w:rPr>
-              <w:t>Confluence</w:t>
-            </w:r>
-            <w:proofErr w:type="spellEnd"/>
-            <w:r>
-              <w:rPr>
-                <w:sz w:val="21"/>
-                <w:szCs w:val="21"/>
-              </w:rPr>
-              <w:t xml:space="preserve">) que requiere </w:t>
-            </w:r>
-            <w:proofErr w:type="spellStart"/>
-            <w:r>
-              <w:rPr>
-                <w:sz w:val="21"/>
-                <w:szCs w:val="21"/>
-              </w:rPr>
-              <w:t>practica</w:t>
-            </w:r>
-            <w:proofErr w:type="spellEnd"/>
-            <w:r>
-              <w:rPr>
-                <w:sz w:val="21"/>
-                <w:szCs w:val="21"/>
-              </w:rPr>
-              <w:t>.</w:t>
+              <w:t>D4. Curva de aprendizaje en herramientas de gestion agil (Jira, Confluence) que requiere practica.</w:t>
             </w:r>
           </w:p>
           <w:p>
@@ -5554,23 +3559,31 @@
                 <w:sz w:val="21"/>
                 <w:szCs w:val="21"/>
               </w:rPr>
-              <w:t xml:space="preserve">A1. Alta competencia en el mercado laboral IT junior, con gran oferta de egresados de </w:t>
-            </w:r>
-            <w:proofErr w:type="spellStart"/>
+              <w:t>A1. Alta competencia en el mercado laboral IT junior, con gran oferta de egresados de bootcamps.</w:t>
+            </w:r>
+          </w:p>
+          <w:p>
+            <w:pPr>
+              <w:spacing w:after="60"/>
+            </w:pPr>
             <w:r>
               <w:rPr>
                 <w:sz w:val="21"/>
                 <w:szCs w:val="21"/>
               </w:rPr>
-              <w:t>bootcamps</w:t>
-            </w:r>
-            <w:proofErr w:type="spellEnd"/>
+              <w:t>A2. Rapida evolucion tecnologica que exige actualizacion constante de habilidades tecnicas.</w:t>
+            </w:r>
+          </w:p>
+          <w:p>
+            <w:pPr>
+              <w:spacing w:after="60"/>
+            </w:pPr>
             <w:r>
               <w:rPr>
                 <w:sz w:val="21"/>
                 <w:szCs w:val="21"/>
               </w:rPr>
-              <w:t>.</w:t>
+              <w:t>A3. Incertidumbre economica regional que puede impactar en la cantidad de vacantes disponibles.</w:t>
             </w:r>
           </w:p>
           <w:p>
@@ -5582,200 +3595,16 @@
                 <w:sz w:val="21"/>
                 <w:szCs w:val="21"/>
               </w:rPr>
-              <w:t xml:space="preserve">A2. </w:t>
-            </w:r>
-            <w:proofErr w:type="spellStart"/>
+              <w:t>A4. Automatizacion e IA generativa que puede reemplazar tareas entry-level, elevando el umbral de entrada.</w:t>
+            </w:r>
+          </w:p>
+          <w:p>
             <w:r>
               <w:rPr>
                 <w:sz w:val="21"/>
                 <w:szCs w:val="21"/>
               </w:rPr>
-              <w:t>Rapida</w:t>
-            </w:r>
-            <w:proofErr w:type="spellEnd"/>
-            <w:r>
-              <w:rPr>
-                <w:sz w:val="21"/>
-                <w:szCs w:val="21"/>
-              </w:rPr>
-              <w:t xml:space="preserve"> </w:t>
-            </w:r>
-            <w:proofErr w:type="spellStart"/>
-            <w:r>
-              <w:rPr>
-                <w:sz w:val="21"/>
-                <w:szCs w:val="21"/>
-              </w:rPr>
-              <w:t>evolucion</w:t>
-            </w:r>
-            <w:proofErr w:type="spellEnd"/>
-            <w:r>
-              <w:rPr>
-                <w:sz w:val="21"/>
-                <w:szCs w:val="21"/>
-              </w:rPr>
-              <w:t xml:space="preserve"> </w:t>
-            </w:r>
-            <w:proofErr w:type="spellStart"/>
-            <w:r>
-              <w:rPr>
-                <w:sz w:val="21"/>
-                <w:szCs w:val="21"/>
-              </w:rPr>
-              <w:t>tecnologica</w:t>
-            </w:r>
-            <w:proofErr w:type="spellEnd"/>
-            <w:r>
-              <w:rPr>
-                <w:sz w:val="21"/>
-                <w:szCs w:val="21"/>
-              </w:rPr>
-              <w:t xml:space="preserve"> que exige </w:t>
-            </w:r>
-            <w:proofErr w:type="spellStart"/>
-            <w:r>
-              <w:rPr>
-                <w:sz w:val="21"/>
-                <w:szCs w:val="21"/>
-              </w:rPr>
-              <w:t>actualizacion</w:t>
-            </w:r>
-            <w:proofErr w:type="spellEnd"/>
-            <w:r>
-              <w:rPr>
-                <w:sz w:val="21"/>
-                <w:szCs w:val="21"/>
-              </w:rPr>
-              <w:t xml:space="preserve"> constante de habilidades </w:t>
-            </w:r>
-            <w:proofErr w:type="spellStart"/>
-            <w:r>
-              <w:rPr>
-                <w:sz w:val="21"/>
-                <w:szCs w:val="21"/>
-              </w:rPr>
-              <w:t>tecnicas</w:t>
-            </w:r>
-            <w:proofErr w:type="spellEnd"/>
-            <w:r>
-              <w:rPr>
-                <w:sz w:val="21"/>
-                <w:szCs w:val="21"/>
-              </w:rPr>
-              <w:t>.</w:t>
-            </w:r>
-          </w:p>
-          <w:p>
-            <w:pPr>
-              <w:spacing w:after="60"/>
-            </w:pPr>
-            <w:r>
-              <w:rPr>
-                <w:sz w:val="21"/>
-                <w:szCs w:val="21"/>
-              </w:rPr>
-              <w:t xml:space="preserve">A3. Incertidumbre </w:t>
-            </w:r>
-            <w:proofErr w:type="spellStart"/>
-            <w:r>
-              <w:rPr>
-                <w:sz w:val="21"/>
-                <w:szCs w:val="21"/>
-              </w:rPr>
-              <w:t>economica</w:t>
-            </w:r>
-            <w:proofErr w:type="spellEnd"/>
-            <w:r>
-              <w:rPr>
-                <w:sz w:val="21"/>
-                <w:szCs w:val="21"/>
-              </w:rPr>
-              <w:t xml:space="preserve"> regional que puede impactar en la cantidad de vacantes disponibles.</w:t>
-            </w:r>
-          </w:p>
-          <w:p>
-            <w:pPr>
-              <w:spacing w:after="60"/>
-            </w:pPr>
-            <w:r>
-              <w:rPr>
-                <w:sz w:val="21"/>
-                <w:szCs w:val="21"/>
-              </w:rPr>
-              <w:t xml:space="preserve">A4. </w:t>
-            </w:r>
-            <w:proofErr w:type="spellStart"/>
-            <w:r>
-              <w:rPr>
-                <w:sz w:val="21"/>
-                <w:szCs w:val="21"/>
-              </w:rPr>
-              <w:t>Automatizacion</w:t>
-            </w:r>
-            <w:proofErr w:type="spellEnd"/>
-            <w:r>
-              <w:rPr>
-                <w:sz w:val="21"/>
-                <w:szCs w:val="21"/>
-              </w:rPr>
-              <w:t xml:space="preserve"> e IA generativa que puede reemplazar tareas </w:t>
-            </w:r>
-            <w:proofErr w:type="spellStart"/>
-            <w:r>
-              <w:rPr>
-                <w:sz w:val="21"/>
-                <w:szCs w:val="21"/>
-              </w:rPr>
-              <w:t>entry-level</w:t>
-            </w:r>
-            <w:proofErr w:type="spellEnd"/>
-            <w:r>
-              <w:rPr>
-                <w:sz w:val="21"/>
-                <w:szCs w:val="21"/>
-              </w:rPr>
-              <w:t>, elevando el umbral de entrada.</w:t>
-            </w:r>
-          </w:p>
-          <w:p>
-            <w:r>
-              <w:rPr>
-                <w:sz w:val="21"/>
-                <w:szCs w:val="21"/>
-              </w:rPr>
-              <w:t xml:space="preserve">A5. Preferencia de algunas empresas por perfiles con </w:t>
-            </w:r>
-            <w:proofErr w:type="spellStart"/>
-            <w:r>
-              <w:rPr>
-                <w:sz w:val="21"/>
-                <w:szCs w:val="21"/>
-              </w:rPr>
-              <w:t>titulacion</w:t>
-            </w:r>
-            <w:proofErr w:type="spellEnd"/>
-            <w:r>
-              <w:rPr>
-                <w:sz w:val="21"/>
-                <w:szCs w:val="21"/>
-              </w:rPr>
-              <w:t xml:space="preserve"> formal en Ciencias de la </w:t>
-            </w:r>
-            <w:proofErr w:type="spellStart"/>
-            <w:r>
-              <w:rPr>
-                <w:sz w:val="21"/>
-                <w:szCs w:val="21"/>
-              </w:rPr>
-              <w:t>Computacion</w:t>
-            </w:r>
-            <w:proofErr w:type="spellEnd"/>
-            <w:r>
-              <w:rPr>
-                <w:sz w:val="21"/>
-                <w:szCs w:val="21"/>
-              </w:rPr>
-              <w:t xml:space="preserve"> o Sistemas.</w:t>
+              <w:t>A5. Preferencia de algunas empresas por perfiles con titulacion formal en Ciencias de la Computacion o Sistemas.</w:t>
             </w:r>
           </w:p>
         </w:tc>
@@ -5828,39 +3657,7 @@
           <w:b/>
           <w:bCs/>
         </w:rPr>
-        <w:t xml:space="preserve">Estrategia FO: Posicionarme activamente en el mercado de </w:t>
-      </w:r>
-      <w:proofErr w:type="spellStart"/>
-      <w:r>
-        <w:rPr>
-          <w:b/>
-          <w:bCs/>
-        </w:rPr>
-        <w:t>transformacion</w:t>
-      </w:r>
-      <w:proofErr w:type="spellEnd"/>
-      <w:r>
-        <w:rPr>
-          <w:b/>
-          <w:bCs/>
-        </w:rPr>
-        <w:t xml:space="preserve"> digital industrial, donde mi perfil hibrido represente una ventaja diferencial frente a candidatos con </w:t>
-      </w:r>
-      <w:proofErr w:type="spellStart"/>
-      <w:r>
-        <w:rPr>
-          <w:b/>
-          <w:bCs/>
-        </w:rPr>
-        <w:t>formacion</w:t>
-      </w:r>
-      <w:proofErr w:type="spellEnd"/>
-      <w:r>
-        <w:rPr>
-          <w:b/>
-          <w:bCs/>
-        </w:rPr>
-        <w:t xml:space="preserve"> puramente IT.</w:t>
+        <w:t>Estrategia FO: Posicionarme activamente en el mercado de transformacion digital industrial, donde mi perfil hibrido represente una ventaja diferencial frente a candidatos con formacion puramente IT.</w:t>
       </w:r>
     </w:p>
     <w:p>
@@ -5878,55 +3675,7 @@
           <w:bCs/>
         </w:rPr>
         <w:lastRenderedPageBreak/>
-        <w:t xml:space="preserve">Estrategia DO: Acelerar el nivel de </w:t>
-      </w:r>
-      <w:proofErr w:type="spellStart"/>
-      <w:r>
-        <w:rPr>
-          <w:b/>
-          <w:bCs/>
-        </w:rPr>
-        <w:t>ingles</w:t>
-      </w:r>
-      <w:proofErr w:type="spellEnd"/>
-      <w:r>
-        <w:rPr>
-          <w:b/>
-          <w:bCs/>
-        </w:rPr>
-        <w:t xml:space="preserve"> </w:t>
-      </w:r>
-      <w:proofErr w:type="spellStart"/>
-      <w:r>
-        <w:rPr>
-          <w:b/>
-          <w:bCs/>
-        </w:rPr>
-        <w:t>tecnico</w:t>
-      </w:r>
-      <w:proofErr w:type="spellEnd"/>
-      <w:r>
-        <w:rPr>
-          <w:b/>
-          <w:bCs/>
-        </w:rPr>
-        <w:t xml:space="preserve"> y ampliar el portafolio con proyectos open </w:t>
-      </w:r>
-      <w:proofErr w:type="spellStart"/>
-      <w:r>
-        <w:rPr>
-          <w:b/>
-          <w:bCs/>
-        </w:rPr>
-        <w:t>source</w:t>
-      </w:r>
-      <w:proofErr w:type="spellEnd"/>
-      <w:r>
-        <w:rPr>
-          <w:b/>
-          <w:bCs/>
-        </w:rPr>
-        <w:t xml:space="preserve"> para superar las principales brechas percibidas por los reclutadores.</w:t>
+        <w:t>Estrategia DO: Acelerar el nivel de ingles tecnico y ampliar el portafolio con proyectos open source para superar las principales brechas percibidas por los reclutadores.</w:t>
       </w:r>
     </w:p>
     <w:p>
@@ -5943,23 +3692,7 @@
           <w:b/>
           <w:bCs/>
         </w:rPr>
-        <w:t xml:space="preserve">Estrategia FA: Construir una marca personal solida en LinkedIn y GitHub, destacando la unicidad del perfil hibrido como diferenciador frente a la competencia de perfiles </w:t>
-      </w:r>
-      <w:proofErr w:type="spellStart"/>
-      <w:r>
-        <w:rPr>
-          <w:b/>
-          <w:bCs/>
-        </w:rPr>
-        <w:t>homogeneos</w:t>
-      </w:r>
-      <w:proofErr w:type="spellEnd"/>
-      <w:r>
-        <w:rPr>
-          <w:b/>
-          <w:bCs/>
-        </w:rPr>
-        <w:t>.</w:t>
+        <w:t>Estrategia FA: Construir una marca personal solida en LinkedIn y GitHub, destacando la unicidad del perfil hibrido como diferenciador frente a la competencia de perfiles homogeneos.</w:t>
       </w:r>
     </w:p>
     <w:p>
@@ -5976,55 +3709,7 @@
           <w:b/>
           <w:bCs/>
         </w:rPr>
-        <w:t>Estrategia DA: Priorizar proyectos colaborativos y entornos de practica (</w:t>
-      </w:r>
-      <w:proofErr w:type="spellStart"/>
-      <w:r>
-        <w:rPr>
-          <w:b/>
-          <w:bCs/>
-        </w:rPr>
-        <w:t>hackathons</w:t>
-      </w:r>
-      <w:proofErr w:type="spellEnd"/>
-      <w:r>
-        <w:rPr>
-          <w:b/>
-          <w:bCs/>
-        </w:rPr>
-        <w:t xml:space="preserve">, contribuciones open </w:t>
-      </w:r>
-      <w:proofErr w:type="spellStart"/>
-      <w:r>
-        <w:rPr>
-          <w:b/>
-          <w:bCs/>
-        </w:rPr>
-        <w:t>source</w:t>
-      </w:r>
-      <w:proofErr w:type="spellEnd"/>
-      <w:r>
-        <w:rPr>
-          <w:b/>
-          <w:bCs/>
-        </w:rPr>
-        <w:t xml:space="preserve">) para ganar experiencia </w:t>
-      </w:r>
-      <w:proofErr w:type="spellStart"/>
-      <w:r>
-        <w:rPr>
-          <w:b/>
-          <w:bCs/>
-        </w:rPr>
-        <w:t>practica</w:t>
-      </w:r>
-      <w:proofErr w:type="spellEnd"/>
-      <w:r>
-        <w:rPr>
-          <w:b/>
-          <w:bCs/>
-        </w:rPr>
-        <w:t xml:space="preserve"> y referencias reales.</w:t>
+        <w:t>Estrategia DA: Priorizar proyectos colaborativos y entornos de practica (hackathons, contribuciones open source) para ganar experiencia practica y referencias reales.</w:t>
       </w:r>
     </w:p>
     <w:p>
@@ -6040,10 +3725,7 @@
         </w:pBdr>
       </w:pPr>
       <w:r>
-        <w:t>Reflexión</w:t>
-      </w:r>
-      <w:r>
-        <w:t xml:space="preserve"> Final</w:t>
+        <w:t>Reflexión Final</w:t>
       </w:r>
     </w:p>
     <w:p>

</xml_diff>